<commit_message>
alterações no trabalho de conclusão
</commit_message>
<xml_diff>
--- a/docs/Trabalho de conclusão - Qualidade de software.docx
+++ b/docs/Trabalho de conclusão - Qualidade de software.docx
@@ -457,7 +457,7 @@
           <w:sz w:val="24"/>
           <w:szCs w:val="24"/>
         </w:rPr>
-        <w:t xml:space="preserve">Este projeto tem como objetivo avaliar de ponta a ponta o site de compras da loja EBAC SHOP, </w:t>
+        <w:t xml:space="preserve">Este projeto </w:t>
       </w:r>
       <w:r>
         <w:rPr>
@@ -466,7 +466,61 @@
           <w:sz w:val="24"/>
           <w:szCs w:val="24"/>
         </w:rPr>
-        <w:t xml:space="preserve">verificando sua estabilidade, </w:t>
+        <w:t>apresenta a análise de qualidade do si</w:t>
+      </w:r>
+      <w:r>
+        <w:rPr>
+          <w:rFonts w:ascii="Arial" w:eastAsia="Arial" w:hAnsi="Arial" w:cs="Arial"/>
+          <w:color w:val="000000" w:themeColor="text1"/>
+          <w:sz w:val="24"/>
+          <w:szCs w:val="24"/>
+        </w:rPr>
+        <w:t>te de compras da loja EBAC SHOP,</w:t>
+      </w:r>
+      <w:r>
+        <w:rPr>
+          <w:rFonts w:ascii="Arial" w:eastAsia="Arial" w:hAnsi="Arial" w:cs="Arial"/>
+          <w:color w:val="000000" w:themeColor="text1"/>
+          <w:sz w:val="24"/>
+          <w:szCs w:val="24"/>
+        </w:rPr>
+        <w:t xml:space="preserve"> com foco na validação de fluxos críticos de negócio por meio de testes em UI e API com Cypress, para isto foi feita uma proposta com planejamento de testes, critérios de aceitação, foram criados casos de testes, execução automatizada, integração continua com Jenkins e consolidação de </w:t>
+      </w:r>
+      <w:r>
+        <w:rPr>
+          <w:rFonts w:ascii="Arial" w:eastAsia="Arial" w:hAnsi="Arial" w:cs="Arial"/>
+          <w:color w:val="000000" w:themeColor="text1"/>
+          <w:sz w:val="24"/>
+          <w:szCs w:val="24"/>
+        </w:rPr>
+        <w:t xml:space="preserve">relatórios. Os resultados foram aderentes aos requisitos implementados no repositório, com testes de cobertura de cenários de caminho feliz e cenários negativos para as histórias de usuários priorizadas, </w:t>
+      </w:r>
+      <w:r>
+        <w:rPr>
+          <w:rFonts w:ascii="Arial" w:eastAsia="Arial" w:hAnsi="Arial" w:cs="Arial"/>
+          <w:color w:val="000000" w:themeColor="text1"/>
+          <w:sz w:val="24"/>
+          <w:szCs w:val="24"/>
+        </w:rPr>
+        <w:t xml:space="preserve">verificando </w:t>
+      </w:r>
+      <w:r>
+        <w:rPr>
+          <w:rFonts w:ascii="Arial" w:eastAsia="Arial" w:hAnsi="Arial" w:cs="Arial"/>
+          <w:color w:val="000000" w:themeColor="text1"/>
+          <w:sz w:val="24"/>
+          <w:szCs w:val="24"/>
+        </w:rPr>
+        <w:t xml:space="preserve">sempre </w:t>
+      </w:r>
+      <w:r>
+        <w:rPr>
+          <w:rFonts w:ascii="Arial" w:eastAsia="Arial" w:hAnsi="Arial" w:cs="Arial"/>
+          <w:color w:val="000000" w:themeColor="text1"/>
+          <w:sz w:val="24"/>
+          <w:szCs w:val="24"/>
+        </w:rPr>
+        <w:t xml:space="preserve">a estabilidade, </w:t>
       </w:r>
       <w:r>
         <w:rPr>
@@ -2480,7 +2534,7 @@
           <w:sz w:val="24"/>
           <w:szCs w:val="24"/>
         </w:rPr>
-        <w:t>N</w:t>
+        <w:t xml:space="preserve">O </w:t>
       </w:r>
       <w:r>
         <w:rPr>
@@ -2489,7 +2543,7 @@
           <w:sz w:val="24"/>
           <w:szCs w:val="24"/>
         </w:rPr>
-        <w:t>esse projeto irei falar sobre o site da loja EBACShop, onde vou fazer uma análise de qualidade, na qual poderão observar todos os aspectos qualitativos, com evidências e com muita percepção da qualidade da loja EBACShop</w:t>
+        <w:t xml:space="preserve">projeto </w:t>
       </w:r>
       <w:r>
         <w:rPr>
@@ -2498,6 +2552,78 @@
           <w:sz w:val="24"/>
           <w:szCs w:val="24"/>
         </w:rPr>
+        <w:t>do</w:t>
+      </w:r>
+      <w:r>
+        <w:rPr>
+          <w:rFonts w:ascii="Arial" w:eastAsia="Arial" w:hAnsi="Arial" w:cs="Arial"/>
+          <w:color w:val="000000" w:themeColor="text1"/>
+          <w:sz w:val="24"/>
+          <w:szCs w:val="24"/>
+        </w:rPr>
+        <w:t xml:space="preserve"> site da loja EBAC</w:t>
+      </w:r>
+      <w:r>
+        <w:rPr>
+          <w:rFonts w:ascii="Arial" w:eastAsia="Arial" w:hAnsi="Arial" w:cs="Arial"/>
+          <w:color w:val="000000" w:themeColor="text1"/>
+          <w:sz w:val="24"/>
+          <w:szCs w:val="24"/>
+        </w:rPr>
+        <w:t xml:space="preserve"> </w:t>
+      </w:r>
+      <w:r>
+        <w:rPr>
+          <w:rFonts w:ascii="Arial" w:eastAsia="Arial" w:hAnsi="Arial" w:cs="Arial"/>
+          <w:color w:val="000000" w:themeColor="text1"/>
+          <w:sz w:val="24"/>
+          <w:szCs w:val="24"/>
+        </w:rPr>
+        <w:t xml:space="preserve">Shop, onde </w:t>
+      </w:r>
+      <w:r>
+        <w:rPr>
+          <w:rFonts w:ascii="Arial" w:eastAsia="Arial" w:hAnsi="Arial" w:cs="Arial"/>
+          <w:color w:val="000000" w:themeColor="text1"/>
+          <w:sz w:val="24"/>
+          <w:szCs w:val="24"/>
+        </w:rPr>
+        <w:t xml:space="preserve">foi feita </w:t>
+      </w:r>
+      <w:r>
+        <w:rPr>
+          <w:rFonts w:ascii="Arial" w:eastAsia="Arial" w:hAnsi="Arial" w:cs="Arial"/>
+          <w:color w:val="000000" w:themeColor="text1"/>
+          <w:sz w:val="24"/>
+          <w:szCs w:val="24"/>
+        </w:rPr>
+        <w:t>uma análise de qualidade, na qual poderão observar todos os aspectos qualitativos, com evidências e com muita percepção da qualidade da loja EBAC</w:t>
+      </w:r>
+      <w:r>
+        <w:rPr>
+          <w:rFonts w:ascii="Arial" w:eastAsia="Arial" w:hAnsi="Arial" w:cs="Arial"/>
+          <w:color w:val="000000" w:themeColor="text1"/>
+          <w:sz w:val="24"/>
+          <w:szCs w:val="24"/>
+        </w:rPr>
+        <w:t xml:space="preserve"> </w:t>
+      </w:r>
+      <w:r>
+        <w:rPr>
+          <w:rFonts w:ascii="Arial" w:eastAsia="Arial" w:hAnsi="Arial" w:cs="Arial"/>
+          <w:color w:val="000000" w:themeColor="text1"/>
+          <w:sz w:val="24"/>
+          <w:szCs w:val="24"/>
+        </w:rPr>
+        <w:t>Shop</w:t>
+      </w:r>
+      <w:r>
+        <w:rPr>
+          <w:rFonts w:ascii="Arial" w:eastAsia="Arial" w:hAnsi="Arial" w:cs="Arial"/>
+          <w:color w:val="000000" w:themeColor="text1"/>
+          <w:sz w:val="24"/>
+          <w:szCs w:val="24"/>
+        </w:rPr>
         <w:t xml:space="preserve">, com foco na avaliação </w:t>
       </w:r>
       <w:r>
@@ -2507,7 +2633,7 @@
           <w:sz w:val="24"/>
           <w:szCs w:val="24"/>
         </w:rPr>
-        <w:t xml:space="preserve">de funcionalidades como desempenho, usabilidade, compatibilidade entre plataforma e segurança básica do sistema.    </w:t>
+        <w:t xml:space="preserve">de funcionalidades como desempenho, usabilidade, compatibilidade entre plataforma e segurança do sistema.    </w:t>
       </w:r>
       <w:r>
         <w:rPr>
@@ -2516,7 +2642,25 @@
           <w:sz w:val="24"/>
           <w:szCs w:val="24"/>
         </w:rPr>
-        <w:t>O EBACShop é uma plataforma de comércio eletrônico voltada para a comercialização de produtos diversos. Por ser um canal essencial de contato com o cliente final, garantir sua estabilidade, fluidez e segurança é fundamental para a manutenção da confiança do usuário e a conversão de vendas.</w:t>
+        <w:t>O EBAC</w:t>
+      </w:r>
+      <w:r>
+        <w:rPr>
+          <w:rFonts w:ascii="Arial" w:eastAsia="Arial" w:hAnsi="Arial" w:cs="Arial"/>
+          <w:color w:val="000000" w:themeColor="text1"/>
+          <w:sz w:val="24"/>
+          <w:szCs w:val="24"/>
+        </w:rPr>
+        <w:t xml:space="preserve"> </w:t>
+      </w:r>
+      <w:r>
+        <w:rPr>
+          <w:rFonts w:ascii="Arial" w:eastAsia="Arial" w:hAnsi="Arial" w:cs="Arial"/>
+          <w:color w:val="000000" w:themeColor="text1"/>
+          <w:sz w:val="24"/>
+          <w:szCs w:val="24"/>
+        </w:rPr>
+        <w:t>Shop é uma plataforma de comércio eletrônico voltada para a comercialização de produtos diversos. Por ser um canal essencial de contato com o cliente final, garantir sua estabilidade, fluidez e segurança é fundamental para a manutenção da confiança do usuário e a conversão de vendas.</w:t>
       </w:r>
       <w:r>
         <w:rPr>
@@ -2885,7 +3029,112 @@
       </w:r>
       <w:bookmarkEnd w:id="4"/>
     </w:p>
-    <w:p/>
+    <w:p>
+      <w:pPr>
+        <w:pStyle w:val="Compact"/>
+        <w:numPr>
+          <w:ilvl w:val="0"/>
+          <w:numId w:val="28"/>
+        </w:numPr>
+        <w:rPr>
+          <w:rFonts w:asciiTheme="minorBidi" w:hAnsiTheme="minorBidi"/>
+          <w:lang w:val="pt-BR"/>
+        </w:rPr>
+      </w:pPr>
+      <w:r>
+        <w:rPr>
+          <w:rFonts w:asciiTheme="minorBidi" w:hAnsiTheme="minorBidi"/>
+          <w:lang w:val="pt-BR"/>
+        </w:rPr>
+        <w:t>Técnicas aplicadas: particionamento por equivalência, valor limite e cenários negativos.</w:t>
+      </w:r>
+    </w:p>
+    <w:p>
+      <w:pPr>
+        <w:pStyle w:val="Compact"/>
+        <w:numPr>
+          <w:ilvl w:val="0"/>
+          <w:numId w:val="28"/>
+        </w:numPr>
+        <w:rPr>
+          <w:rFonts w:asciiTheme="minorBidi" w:hAnsiTheme="minorBidi"/>
+          <w:lang w:val="pt-BR"/>
+        </w:rPr>
+      </w:pPr>
+      <w:r>
+        <w:rPr>
+          <w:rFonts w:asciiTheme="minorBidi" w:hAnsiTheme="minorBidi"/>
+          <w:lang w:val="pt-BR"/>
+        </w:rPr>
+        <w:t>Abordagem: caminho feliz, caminho alternativo e caminho de erro.</w:t>
+      </w:r>
+    </w:p>
+    <w:p>
+      <w:pPr>
+        <w:pStyle w:val="Compact"/>
+        <w:numPr>
+          <w:ilvl w:val="0"/>
+          <w:numId w:val="28"/>
+        </w:numPr>
+        <w:rPr>
+          <w:rFonts w:asciiTheme="minorBidi" w:hAnsiTheme="minorBidi"/>
+          <w:lang w:val="pt-BR"/>
+        </w:rPr>
+      </w:pPr>
+      <w:r>
+        <w:rPr>
+          <w:rFonts w:asciiTheme="minorBidi" w:hAnsiTheme="minorBidi"/>
+          <w:lang w:val="pt-BR"/>
+        </w:rPr>
+        <w:t xml:space="preserve">Ferramentas: Cypress para UI e API, Jenkins para CI e </w:t>
+      </w:r>
+      <w:proofErr w:type="spellStart"/>
+      <w:r>
+        <w:rPr>
+          <w:rFonts w:asciiTheme="minorBidi" w:hAnsiTheme="minorBidi"/>
+          <w:lang w:val="pt-BR"/>
+        </w:rPr>
+        <w:t>Mochawesome</w:t>
+      </w:r>
+      <w:proofErr w:type="spellEnd"/>
+      <w:r>
+        <w:rPr>
+          <w:rFonts w:asciiTheme="minorBidi" w:hAnsiTheme="minorBidi"/>
+          <w:lang w:val="pt-BR"/>
+        </w:rPr>
+        <w:t xml:space="preserve"> para relatórios.</w:t>
+      </w:r>
+    </w:p>
+    <w:p>
+      <w:pPr>
+        <w:pStyle w:val="Compact"/>
+        <w:numPr>
+          <w:ilvl w:val="0"/>
+          <w:numId w:val="28"/>
+        </w:numPr>
+        <w:rPr>
+          <w:rFonts w:asciiTheme="minorBidi" w:hAnsiTheme="minorBidi"/>
+          <w:lang w:val="pt-BR"/>
+        </w:rPr>
+      </w:pPr>
+      <w:r>
+        <w:rPr>
+          <w:rFonts w:asciiTheme="minorBidi" w:hAnsiTheme="minorBidi"/>
+          <w:lang w:val="pt-BR"/>
+        </w:rPr>
+        <w:t>Evidências: arquivos de relatório em Cypress/Reports.</w:t>
+      </w:r>
+    </w:p>
+    <w:p>
+      <w:pPr>
+        <w:pStyle w:val="Compact"/>
+        <w:ind w:left="720"/>
+        <w:rPr>
+          <w:rFonts w:asciiTheme="minorBidi" w:hAnsiTheme="minorBidi"/>
+          <w:lang w:val="pt-BR"/>
+        </w:rPr>
+      </w:pPr>
+    </w:p>
     <w:p>
       <w:pPr>
         <w:pStyle w:val="PargrafodaLista"/>
@@ -2954,60 +3203,11 @@
     </w:p>
     <w:p>
       <w:pPr>
-        <w:rPr>
-          <w:rFonts w:ascii="Arial" w:hAnsi="Arial" w:cs="Arial"/>
-          <w:color w:val="000000" w:themeColor="text1"/>
-          <w:sz w:val="24"/>
-          <w:szCs w:val="24"/>
-        </w:rPr>
-      </w:pPr>
-    </w:p>
-    <w:p>
-      <w:pPr>
-        <w:rPr>
-          <w:rFonts w:ascii="Arial" w:hAnsi="Arial" w:cs="Arial"/>
-          <w:color w:val="000000" w:themeColor="text1"/>
-          <w:sz w:val="24"/>
-          <w:szCs w:val="24"/>
-        </w:rPr>
-      </w:pPr>
-    </w:p>
-    <w:p>
-      <w:pPr>
-        <w:rPr>
-          <w:rFonts w:ascii="Arial" w:hAnsi="Arial" w:cs="Arial"/>
-          <w:color w:val="000000" w:themeColor="text1"/>
-          <w:sz w:val="24"/>
-          <w:szCs w:val="24"/>
-        </w:rPr>
-      </w:pPr>
-    </w:p>
-    <w:p>
-      <w:pPr>
-        <w:rPr>
-          <w:rFonts w:ascii="Arial" w:hAnsi="Arial" w:cs="Arial"/>
-          <w:color w:val="000000" w:themeColor="text1"/>
-          <w:sz w:val="24"/>
-          <w:szCs w:val="24"/>
-        </w:rPr>
-      </w:pPr>
-    </w:p>
-    <w:p>
-      <w:pPr>
-        <w:rPr>
-          <w:rFonts w:ascii="Arial" w:hAnsi="Arial" w:cs="Arial"/>
-          <w:color w:val="000000" w:themeColor="text1"/>
-          <w:sz w:val="24"/>
-          <w:szCs w:val="24"/>
-        </w:rPr>
-      </w:pPr>
-    </w:p>
-    <w:p>
-      <w:pPr>
         <w:pStyle w:val="Ttulo2"/>
       </w:pPr>
       <w:bookmarkStart w:id="5" w:name="_Toc85541174"/>
       <w:r>
+        <w:lastRenderedPageBreak/>
         <w:t>Critérios de aceitação</w:t>
       </w:r>
       <w:bookmarkEnd w:id="5"/>
@@ -4049,7 +4249,25 @@
           <w:sz w:val="24"/>
           <w:szCs w:val="24"/>
         </w:rPr>
-        <w:t xml:space="preserve"> “usuário@ebacshop.com.br”</w:t>
+        <w:t xml:space="preserve"> “</w:t>
+      </w:r>
+      <w:r>
+        <w:rPr>
+          <w:rFonts w:ascii="Arial" w:hAnsi="Arial" w:cs="Arial"/>
+          <w:color w:val="000000" w:themeColor="text1"/>
+          <w:sz w:val="24"/>
+          <w:szCs w:val="24"/>
+        </w:rPr>
+        <w:t>Teste01@ebac.com.br</w:t>
+      </w:r>
+      <w:r>
+        <w:rPr>
+          <w:rFonts w:ascii="Arial" w:hAnsi="Arial" w:cs="Arial"/>
+          <w:color w:val="000000" w:themeColor="text1"/>
+          <w:sz w:val="24"/>
+          <w:szCs w:val="24"/>
+        </w:rPr>
+        <w:t>”</w:t>
       </w:r>
     </w:p>
     <w:p>
@@ -4088,7 +4306,25 @@
           <w:sz w:val="24"/>
           <w:szCs w:val="24"/>
         </w:rPr>
-        <w:t>“Ebac123”</w:t>
+        <w:t>“</w:t>
+      </w:r>
+      <w:r>
+        <w:rPr>
+          <w:rFonts w:ascii="Arial" w:hAnsi="Arial" w:cs="Arial"/>
+          <w:color w:val="000000" w:themeColor="text1"/>
+          <w:sz w:val="24"/>
+          <w:szCs w:val="24"/>
+        </w:rPr>
+        <w:t>Ebac123@</w:t>
+      </w:r>
+      <w:r>
+        <w:rPr>
+          <w:rFonts w:ascii="Arial" w:hAnsi="Arial" w:cs="Arial"/>
+          <w:color w:val="000000" w:themeColor="text1"/>
+          <w:sz w:val="24"/>
+          <w:szCs w:val="24"/>
+        </w:rPr>
+        <w:t>”</w:t>
       </w:r>
     </w:p>
     <w:p>
@@ -4144,28 +4380,6 @@
     </w:p>
     <w:p>
       <w:pPr>
-        <w:ind w:left="708"/>
-        <w:rPr>
-          <w:rFonts w:ascii="Arial" w:hAnsi="Arial" w:cs="Arial"/>
-          <w:color w:val="000000" w:themeColor="text1"/>
-          <w:sz w:val="24"/>
-          <w:szCs w:val="24"/>
-        </w:rPr>
-      </w:pPr>
-    </w:p>
-    <w:p>
-      <w:pPr>
-        <w:ind w:left="708"/>
-        <w:rPr>
-          <w:rFonts w:ascii="Arial" w:hAnsi="Arial" w:cs="Arial"/>
-          <w:color w:val="000000" w:themeColor="text1"/>
-          <w:sz w:val="24"/>
-          <w:szCs w:val="24"/>
-        </w:rPr>
-      </w:pPr>
-    </w:p>
-    <w:p>
-      <w:pPr>
         <w:spacing w:after="0"/>
         <w:ind w:left="708"/>
         <w:rPr>
@@ -4182,7 +4396,6 @@
           <w:sz w:val="24"/>
           <w:szCs w:val="24"/>
         </w:rPr>
-        <w:lastRenderedPageBreak/>
         <w:t>Cenário 2</w:t>
       </w:r>
       <w:r>
@@ -4488,16 +4701,14 @@
             <w:tcW w:w="2835" w:type="dxa"/>
           </w:tcPr>
           <w:p>
-            <w:hyperlink r:id="rId8" w:history="1">
-              <w:r>
-                <w:rPr>
-                  <w:rStyle w:val="Hyperlink"/>
-                </w:rPr>
-                <w:t>usuario@ebacshop.com.br</w:t>
-              </w:r>
-            </w:hyperlink>
             <w:r>
-              <w:t xml:space="preserve"> </w:t>
+              <w:rPr>
+                <w:rFonts w:ascii="Arial" w:hAnsi="Arial" w:cs="Arial"/>
+                <w:color w:val="000000" w:themeColor="text1"/>
+                <w:sz w:val="24"/>
+                <w:szCs w:val="24"/>
+              </w:rPr>
+              <w:t>Teste01@ebac.com.br</w:t>
             </w:r>
           </w:p>
         </w:tc>
@@ -4558,16 +4769,23 @@
             <w:tcW w:w="2835" w:type="dxa"/>
           </w:tcPr>
           <w:p>
-            <w:hyperlink r:id="rId9" w:history="1">
-              <w:r>
-                <w:rPr>
-                  <w:rStyle w:val="Hyperlink"/>
-                </w:rPr>
-                <w:t>invalido@ebacshop.com.br</w:t>
-              </w:r>
-            </w:hyperlink>
             <w:r>
-              <w:t xml:space="preserve"> </w:t>
+              <w:rPr>
+                <w:rFonts w:ascii="Arial" w:hAnsi="Arial" w:cs="Arial"/>
+                <w:color w:val="000000" w:themeColor="text1"/>
+                <w:sz w:val="24"/>
+                <w:szCs w:val="24"/>
+              </w:rPr>
+              <w:t xml:space="preserve"> invalido</w:t>
+            </w:r>
+            <w:r>
+              <w:rPr>
+                <w:rFonts w:ascii="Arial" w:hAnsi="Arial" w:cs="Arial"/>
+                <w:color w:val="000000" w:themeColor="text1"/>
+                <w:sz w:val="24"/>
+                <w:szCs w:val="24"/>
+              </w:rPr>
+              <w:t>@ebac.com.br</w:t>
             </w:r>
           </w:p>
         </w:tc>
@@ -4636,14 +4854,15 @@
                 <w:szCs w:val="24"/>
               </w:rPr>
             </w:pPr>
-            <w:hyperlink r:id="rId10" w:history="1">
-              <w:r>
-                <w:rPr>
-                  <w:rStyle w:val="Hyperlink"/>
-                </w:rPr>
-                <w:t>usuario@ebacshop.com.br</w:t>
-              </w:r>
-            </w:hyperlink>
+            <w:r>
+              <w:rPr>
+                <w:rFonts w:ascii="Arial" w:hAnsi="Arial" w:cs="Arial"/>
+                <w:color w:val="000000" w:themeColor="text1"/>
+                <w:sz w:val="24"/>
+                <w:szCs w:val="24"/>
+              </w:rPr>
+              <w:t>Teste01@ebac.com.br</w:t>
+            </w:r>
           </w:p>
         </w:tc>
         <w:tc>
@@ -4721,6 +4940,15 @@
               </w:rPr>
               <w:t>Ebac123</w:t>
             </w:r>
+            <w:r>
+              <w:rPr>
+                <w:rFonts w:ascii="Arial" w:hAnsi="Arial" w:cs="Arial"/>
+                <w:color w:val="000000" w:themeColor="text1"/>
+                <w:sz w:val="24"/>
+                <w:szCs w:val="24"/>
+              </w:rPr>
+              <w:t>@</w:t>
+            </w:r>
           </w:p>
         </w:tc>
         <w:tc>
@@ -4837,6 +5065,30 @@
         </w:rPr>
         <w:t xml:space="preserve"> </w:t>
       </w:r>
+    </w:p>
+    <w:p>
+      <w:pPr>
+        <w:spacing w:after="0"/>
+        <w:ind w:left="708"/>
+        <w:rPr>
+          <w:rFonts w:ascii="Arial" w:hAnsi="Arial" w:cs="Arial"/>
+          <w:color w:val="000000" w:themeColor="text1"/>
+          <w:sz w:val="24"/>
+          <w:szCs w:val="24"/>
+        </w:rPr>
+      </w:pPr>
+    </w:p>
+    <w:p>
+      <w:pPr>
+        <w:spacing w:after="0"/>
+        <w:ind w:left="708"/>
+        <w:rPr>
+          <w:rFonts w:ascii="Arial" w:hAnsi="Arial" w:cs="Arial"/>
+          <w:color w:val="000000" w:themeColor="text1"/>
+          <w:sz w:val="24"/>
+          <w:szCs w:val="24"/>
+        </w:rPr>
+      </w:pPr>
     </w:p>
     <w:p>
       <w:pPr>
@@ -5545,6 +5797,403 @@
       </w:r>
       <w:bookmarkEnd w:id="9"/>
     </w:p>
+    <w:p/>
+    <w:p>
+      <w:pPr>
+        <w:pStyle w:val="Ttulo2"/>
+        <w:numPr>
+          <w:ilvl w:val="2"/>
+          <w:numId w:val="9"/>
+        </w:numPr>
+      </w:pPr>
+      <w:bookmarkStart w:id="10" w:name="_Toc85541179"/>
+      <w:r>
+        <w:t>História de usuário 1:</w:t>
+      </w:r>
+      <w:bookmarkEnd w:id="10"/>
+      <w:r>
+        <w:t xml:space="preserve"> </w:t>
+      </w:r>
+      <w:r>
+        <w:t>[US-0001] – Adicionar item ao carrinho</w:t>
+      </w:r>
+      <w:r>
+        <w:t xml:space="preserve">: </w:t>
+      </w:r>
+    </w:p>
+    <w:p>
+      <w:pPr>
+        <w:pStyle w:val="Compact"/>
+        <w:numPr>
+          <w:ilvl w:val="0"/>
+          <w:numId w:val="28"/>
+        </w:numPr>
+        <w:ind w:left="720"/>
+        <w:rPr>
+          <w:lang w:val="pt-BR"/>
+        </w:rPr>
+      </w:pPr>
+      <w:r>
+        <w:rPr>
+          <w:rFonts w:ascii="Arial" w:hAnsi="Arial" w:cs="Arial"/>
+          <w:color w:val="000000" w:themeColor="text1"/>
+          <w:lang w:val="pt-BR"/>
+        </w:rPr>
+        <w:t>CT01:</w:t>
+      </w:r>
+      <w:r>
+        <w:rPr>
+          <w:lang w:val="pt-BR"/>
+        </w:rPr>
+        <w:t xml:space="preserve"> </w:t>
+      </w:r>
+      <w:r>
+        <w:rPr>
+          <w:rFonts w:asciiTheme="minorBidi" w:hAnsiTheme="minorBidi"/>
+          <w:lang w:val="pt-BR"/>
+        </w:rPr>
+        <w:t>Deve selecionar um produto da lista e adicionar ao carrinho com sucesso</w:t>
+      </w:r>
+      <w:r>
+        <w:rPr>
+          <w:rFonts w:asciiTheme="minorBidi" w:hAnsiTheme="minorBidi"/>
+          <w:color w:val="000000" w:themeColor="text1"/>
+          <w:lang w:val="pt-BR"/>
+        </w:rPr>
+        <w:t>.</w:t>
+      </w:r>
+    </w:p>
+    <w:p>
+      <w:pPr>
+        <w:ind w:left="708"/>
+        <w:rPr>
+          <w:rFonts w:ascii="Arial" w:hAnsi="Arial" w:cs="Arial"/>
+          <w:color w:val="000000" w:themeColor="text1"/>
+          <w:sz w:val="24"/>
+          <w:szCs w:val="24"/>
+        </w:rPr>
+      </w:pPr>
+      <w:r>
+        <w:rPr>
+          <w:rFonts w:ascii="Arial" w:hAnsi="Arial" w:cs="Arial"/>
+          <w:color w:val="000000" w:themeColor="text1"/>
+          <w:sz w:val="24"/>
+          <w:szCs w:val="24"/>
+        </w:rPr>
+        <w:t>CT02:</w:t>
+      </w:r>
+      <w:r>
+        <w:t xml:space="preserve"> </w:t>
+      </w:r>
+      <w:r>
+        <w:rPr>
+          <w:rFonts w:asciiTheme="minorBidi" w:hAnsiTheme="minorBidi"/>
+          <w:sz w:val="24"/>
+          <w:szCs w:val="24"/>
+        </w:rPr>
+        <w:t>Deve adicionar quantidade válida e confirmar mensagem de sucesso.</w:t>
+      </w:r>
+    </w:p>
+    <w:p>
+      <w:pPr>
+        <w:ind w:left="708"/>
+        <w:rPr>
+          <w:rFonts w:ascii="Arial" w:hAnsi="Arial" w:cs="Arial"/>
+          <w:color w:val="000000" w:themeColor="text1"/>
+          <w:sz w:val="24"/>
+          <w:szCs w:val="24"/>
+        </w:rPr>
+      </w:pPr>
+      <w:r>
+        <w:rPr>
+          <w:rFonts w:ascii="Arial" w:hAnsi="Arial" w:cs="Arial"/>
+          <w:color w:val="000000" w:themeColor="text1"/>
+          <w:sz w:val="24"/>
+          <w:szCs w:val="24"/>
+        </w:rPr>
+        <w:lastRenderedPageBreak/>
+        <w:t>CT03:</w:t>
+      </w:r>
+      <w:r>
+        <w:t xml:space="preserve"> </w:t>
+      </w:r>
+      <w:r>
+        <w:rPr>
+          <w:rFonts w:asciiTheme="minorBidi" w:hAnsiTheme="minorBidi"/>
+          <w:sz w:val="24"/>
+          <w:szCs w:val="24"/>
+        </w:rPr>
+        <w:t>Deve validar limite máximo permitido e tentativa acima do limite.</w:t>
+      </w:r>
+      <w:r>
+        <w:rPr>
+          <w:rFonts w:ascii="Arial" w:hAnsi="Arial" w:cs="Arial"/>
+          <w:color w:val="000000" w:themeColor="text1"/>
+          <w:sz w:val="24"/>
+          <w:szCs w:val="24"/>
+        </w:rPr>
+        <w:br/>
+      </w:r>
+    </w:p>
+    <w:p>
+      <w:pPr>
+        <w:pStyle w:val="Ttulo2"/>
+        <w:numPr>
+          <w:ilvl w:val="2"/>
+          <w:numId w:val="9"/>
+        </w:numPr>
+      </w:pPr>
+      <w:bookmarkStart w:id="11" w:name="_Toc85541180"/>
+      <w:r>
+        <w:t>História de usuário 2:</w:t>
+      </w:r>
+      <w:bookmarkEnd w:id="11"/>
+      <w:r>
+        <w:t xml:space="preserve"> </w:t>
+      </w:r>
+    </w:p>
+    <w:p>
+      <w:pPr>
+        <w:ind w:left="708"/>
+        <w:rPr>
+          <w:rFonts w:asciiTheme="minorBidi" w:hAnsiTheme="minorBidi"/>
+          <w:color w:val="000000" w:themeColor="text1"/>
+          <w:sz w:val="24"/>
+          <w:szCs w:val="24"/>
+        </w:rPr>
+      </w:pPr>
+      <w:r>
+        <w:rPr>
+          <w:rFonts w:asciiTheme="minorBidi" w:hAnsiTheme="minorBidi"/>
+          <w:color w:val="000000" w:themeColor="text1"/>
+          <w:sz w:val="24"/>
+          <w:szCs w:val="24"/>
+        </w:rPr>
+        <w:t>CT01:</w:t>
+      </w:r>
+      <w:r>
+        <w:rPr>
+          <w:rFonts w:asciiTheme="minorBidi" w:hAnsiTheme="minorBidi"/>
+          <w:sz w:val="24"/>
+          <w:szCs w:val="24"/>
+        </w:rPr>
+        <w:t xml:space="preserve"> Deve realizar login com credenciais validas.</w:t>
+      </w:r>
+    </w:p>
+    <w:p>
+      <w:pPr>
+        <w:ind w:left="708"/>
+        <w:rPr>
+          <w:rFonts w:asciiTheme="minorBidi" w:hAnsiTheme="minorBidi"/>
+          <w:color w:val="000000" w:themeColor="text1"/>
+          <w:sz w:val="24"/>
+          <w:szCs w:val="24"/>
+        </w:rPr>
+      </w:pPr>
+      <w:r>
+        <w:rPr>
+          <w:rFonts w:asciiTheme="minorBidi" w:hAnsiTheme="minorBidi"/>
+          <w:color w:val="000000" w:themeColor="text1"/>
+          <w:sz w:val="24"/>
+          <w:szCs w:val="24"/>
+        </w:rPr>
+        <w:t>CT02:</w:t>
+      </w:r>
+      <w:r>
+        <w:rPr>
+          <w:rFonts w:asciiTheme="minorBidi" w:hAnsiTheme="minorBidi"/>
+          <w:sz w:val="24"/>
+          <w:szCs w:val="24"/>
+        </w:rPr>
+        <w:t xml:space="preserve"> Deve bloquear login com senha invalida.</w:t>
+      </w:r>
+    </w:p>
+    <w:p>
+      <w:pPr>
+        <w:ind w:left="708"/>
+        <w:rPr>
+          <w:rFonts w:asciiTheme="minorBidi" w:hAnsiTheme="minorBidi"/>
+          <w:color w:val="000000" w:themeColor="text1"/>
+          <w:sz w:val="24"/>
+          <w:szCs w:val="24"/>
+        </w:rPr>
+      </w:pPr>
+      <w:r>
+        <w:rPr>
+          <w:rFonts w:asciiTheme="minorBidi" w:hAnsiTheme="minorBidi"/>
+          <w:color w:val="000000" w:themeColor="text1"/>
+          <w:sz w:val="24"/>
+          <w:szCs w:val="24"/>
+        </w:rPr>
+        <w:t>CT03:</w:t>
+      </w:r>
+      <w:r>
+        <w:rPr>
+          <w:rFonts w:asciiTheme="minorBidi" w:hAnsiTheme="minorBidi"/>
+          <w:sz w:val="24"/>
+          <w:szCs w:val="24"/>
+        </w:rPr>
+        <w:t xml:space="preserve"> Deve validar obrigatoriedade de e-mail e senha.</w:t>
+      </w:r>
+    </w:p>
+    <w:p>
+      <w:pPr>
+        <w:ind w:left="708"/>
+        <w:rPr>
+          <w:rFonts w:ascii="Arial" w:hAnsi="Arial" w:cs="Arial"/>
+          <w:color w:val="000000" w:themeColor="text1"/>
+          <w:sz w:val="24"/>
+          <w:szCs w:val="24"/>
+        </w:rPr>
+      </w:pPr>
+    </w:p>
+    <w:p>
+      <w:pPr>
+        <w:pStyle w:val="Ttulo2"/>
+        <w:numPr>
+          <w:ilvl w:val="2"/>
+          <w:numId w:val="16"/>
+        </w:numPr>
+      </w:pPr>
+      <w:bookmarkStart w:id="12" w:name="_Toc85541181"/>
+      <w:r>
+        <w:t xml:space="preserve">História de usuário 3: </w:t>
+      </w:r>
+      <w:r>
+        <w:t>API de Cupom</w:t>
+      </w:r>
+      <w:bookmarkEnd w:id="12"/>
+    </w:p>
+    <w:p>
+      <w:pPr>
+        <w:pStyle w:val="Compact"/>
+        <w:numPr>
+          <w:ilvl w:val="0"/>
+          <w:numId w:val="28"/>
+        </w:numPr>
+        <w:ind w:left="720"/>
+        <w:rPr>
+          <w:rFonts w:asciiTheme="minorBidi" w:hAnsiTheme="minorBidi"/>
+          <w:lang w:val="pt-BR"/>
+        </w:rPr>
+      </w:pPr>
+      <w:r>
+        <w:rPr>
+          <w:rFonts w:asciiTheme="minorBidi" w:hAnsiTheme="minorBidi"/>
+          <w:color w:val="000000" w:themeColor="text1"/>
+          <w:lang w:val="pt-BR"/>
+        </w:rPr>
+        <w:t>CT01:</w:t>
+      </w:r>
+      <w:r>
+        <w:rPr>
+          <w:rFonts w:asciiTheme="minorBidi" w:hAnsiTheme="minorBidi"/>
+          <w:lang w:val="pt-BR"/>
+        </w:rPr>
+        <w:t xml:space="preserve"> Deve listar todos os cupons cadastrados (status 200).</w:t>
+      </w:r>
+    </w:p>
+    <w:p>
+      <w:pPr>
+        <w:pStyle w:val="Compact"/>
+        <w:numPr>
+          <w:ilvl w:val="0"/>
+          <w:numId w:val="28"/>
+        </w:numPr>
+        <w:ind w:left="720"/>
+        <w:rPr>
+          <w:rFonts w:asciiTheme="minorBidi" w:hAnsiTheme="minorBidi"/>
+          <w:lang w:val="pt-BR"/>
+        </w:rPr>
+      </w:pPr>
+      <w:r>
+        <w:rPr>
+          <w:rFonts w:asciiTheme="minorBidi" w:hAnsiTheme="minorBidi"/>
+          <w:color w:val="000000" w:themeColor="text1"/>
+          <w:lang w:val="pt-BR"/>
+        </w:rPr>
+        <w:t>CT02:</w:t>
+      </w:r>
+      <w:r>
+        <w:rPr>
+          <w:rFonts w:asciiTheme="minorBidi" w:hAnsiTheme="minorBidi"/>
+          <w:lang w:val="pt-BR"/>
+        </w:rPr>
+        <w:t xml:space="preserve"> Deve retornar cupom específico ao consultar por ID valido (status 200).</w:t>
+      </w:r>
+    </w:p>
+    <w:p>
+      <w:pPr>
+        <w:pStyle w:val="Compact"/>
+        <w:numPr>
+          <w:ilvl w:val="0"/>
+          <w:numId w:val="28"/>
+        </w:numPr>
+        <w:ind w:left="720"/>
+        <w:rPr>
+          <w:rFonts w:asciiTheme="minorBidi" w:hAnsiTheme="minorBidi"/>
+          <w:lang w:val="pt-BR"/>
+        </w:rPr>
+      </w:pPr>
+      <w:r>
+        <w:rPr>
+          <w:rFonts w:asciiTheme="minorBidi" w:hAnsiTheme="minorBidi"/>
+          <w:color w:val="000000" w:themeColor="text1"/>
+          <w:lang w:val="pt-BR"/>
+        </w:rPr>
+        <w:t>CT03:</w:t>
+      </w:r>
+      <w:r>
+        <w:rPr>
+          <w:rFonts w:asciiTheme="minorBidi" w:hAnsiTheme="minorBidi"/>
+          <w:lang w:val="pt-BR"/>
+        </w:rPr>
+        <w:t xml:space="preserve"> Deve cadastrar cupom com campos obrigatórios (status 201).</w:t>
+      </w:r>
+    </w:p>
+    <w:p>
+      <w:pPr>
+        <w:pStyle w:val="Compact"/>
+        <w:numPr>
+          <w:ilvl w:val="0"/>
+          <w:numId w:val="28"/>
+        </w:numPr>
+        <w:ind w:left="720"/>
+        <w:rPr>
+          <w:rFonts w:asciiTheme="minorBidi" w:hAnsiTheme="minorBidi"/>
+          <w:lang w:val="pt-BR"/>
+        </w:rPr>
+      </w:pPr>
+      <w:r>
+        <w:rPr>
+          <w:rFonts w:asciiTheme="minorBidi" w:hAnsiTheme="minorBidi"/>
+          <w:lang w:val="pt-BR"/>
+        </w:rPr>
+        <w:t>CT04: Não deve permitir cupom com código repetido (status 400).</w:t>
+      </w:r>
+    </w:p>
+    <w:p>
+      <w:pPr>
+        <w:pStyle w:val="Compact"/>
+        <w:ind w:left="720"/>
+        <w:rPr>
+          <w:lang w:val="pt-BR"/>
+        </w:rPr>
+      </w:pPr>
+    </w:p>
+    <w:p>
+      <w:pPr>
+        <w:pStyle w:val="Ttulo2"/>
+      </w:pPr>
+      <w:r>
+        <w:t xml:space="preserve"> </w:t>
+      </w:r>
+      <w:bookmarkStart w:id="13" w:name="_Toc85541182"/>
+      <w:r>
+        <w:t>Repositório no Github</w:t>
+      </w:r>
+      <w:bookmarkEnd w:id="13"/>
+    </w:p>
     <w:p>
       <w:pPr>
         <w:pStyle w:val="PargrafodaLista"/>
@@ -5566,609 +6215,6 @@
           <w:sz w:val="24"/>
           <w:szCs w:val="24"/>
         </w:rPr>
-        <w:t>Crie</w:t>
-      </w:r>
-      <w:r>
-        <w:rPr>
-          <w:rFonts w:ascii="Arial" w:hAnsi="Arial" w:cs="Arial"/>
-          <w:color w:val="000000" w:themeColor="text1"/>
-          <w:sz w:val="24"/>
-          <w:szCs w:val="24"/>
-        </w:rPr>
-        <w:t xml:space="preserve"> pelo menos </w:t>
-      </w:r>
-      <w:r>
-        <w:rPr>
-          <w:rFonts w:ascii="Arial" w:hAnsi="Arial" w:cs="Arial"/>
-          <w:color w:val="000000" w:themeColor="text1"/>
-          <w:sz w:val="24"/>
-          <w:szCs w:val="24"/>
-        </w:rPr>
-        <w:t>3</w:t>
-      </w:r>
-      <w:r>
-        <w:rPr>
-          <w:rFonts w:ascii="Arial" w:hAnsi="Arial" w:cs="Arial"/>
-          <w:color w:val="000000" w:themeColor="text1"/>
-          <w:sz w:val="24"/>
-          <w:szCs w:val="24"/>
-        </w:rPr>
-        <w:t xml:space="preserve"> casos de testes para cada história</w:t>
-      </w:r>
-      <w:r>
-        <w:rPr>
-          <w:rFonts w:ascii="Arial" w:hAnsi="Arial" w:cs="Arial"/>
-          <w:color w:val="000000" w:themeColor="text1"/>
-          <w:sz w:val="24"/>
-          <w:szCs w:val="24"/>
-        </w:rPr>
-        <w:t xml:space="preserve"> de usuário</w:t>
-      </w:r>
-      <w:r>
-        <w:rPr>
-          <w:rFonts w:ascii="Arial" w:hAnsi="Arial" w:cs="Arial"/>
-          <w:color w:val="000000" w:themeColor="text1"/>
-          <w:sz w:val="24"/>
-          <w:szCs w:val="24"/>
-        </w:rPr>
-        <w:t xml:space="preserve">, sempre que possível, </w:t>
-      </w:r>
-      <w:r>
-        <w:rPr>
-          <w:rFonts w:ascii="Arial" w:hAnsi="Arial" w:cs="Arial"/>
-          <w:color w:val="000000" w:themeColor="text1"/>
-          <w:sz w:val="24"/>
-          <w:szCs w:val="24"/>
-        </w:rPr>
-        <w:t xml:space="preserve">usando as técnicas de testes (partição de equivalência, valor limite, tabela de </w:t>
-      </w:r>
-      <w:r>
-        <w:rPr>
-          <w:rFonts w:ascii="Arial" w:hAnsi="Arial" w:cs="Arial"/>
-          <w:color w:val="000000" w:themeColor="text1"/>
-          <w:sz w:val="24"/>
-          <w:szCs w:val="24"/>
-        </w:rPr>
-        <w:t>decisão etc.</w:t>
-      </w:r>
-      <w:r>
-        <w:rPr>
-          <w:rFonts w:ascii="Arial" w:hAnsi="Arial" w:cs="Arial"/>
-          <w:color w:val="000000" w:themeColor="text1"/>
-          <w:sz w:val="24"/>
-          <w:szCs w:val="24"/>
-        </w:rPr>
-        <w:t xml:space="preserve">). </w:t>
-      </w:r>
-    </w:p>
-    <w:p>
-      <w:pPr>
-        <w:pStyle w:val="PargrafodaLista"/>
-        <w:numPr>
-          <w:ilvl w:val="0"/>
-          <w:numId w:val="17"/>
-        </w:numPr>
-        <w:rPr>
-          <w:rFonts w:ascii="Arial" w:hAnsi="Arial" w:cs="Arial"/>
-          <w:color w:val="000000" w:themeColor="text1"/>
-          <w:sz w:val="24"/>
-          <w:szCs w:val="24"/>
-        </w:rPr>
-      </w:pPr>
-      <w:r>
-        <w:rPr>
-          <w:rFonts w:ascii="Arial" w:hAnsi="Arial" w:cs="Arial"/>
-          <w:color w:val="000000" w:themeColor="text1"/>
-          <w:sz w:val="24"/>
-          <w:szCs w:val="24"/>
-        </w:rPr>
-        <w:t xml:space="preserve">Considere sempre o caminho feliz (fluxo </w:t>
-      </w:r>
-      <w:r>
-        <w:rPr>
-          <w:rFonts w:ascii="Arial" w:hAnsi="Arial" w:cs="Arial"/>
-          <w:color w:val="000000" w:themeColor="text1"/>
-          <w:sz w:val="24"/>
-          <w:szCs w:val="24"/>
-        </w:rPr>
-        <w:t>principal) e</w:t>
-      </w:r>
-      <w:r>
-        <w:rPr>
-          <w:rFonts w:ascii="Arial" w:hAnsi="Arial" w:cs="Arial"/>
-          <w:color w:val="000000" w:themeColor="text1"/>
-          <w:sz w:val="24"/>
-          <w:szCs w:val="24"/>
-        </w:rPr>
-        <w:t xml:space="preserve"> o caminho alternativo</w:t>
-      </w:r>
-      <w:r>
-        <w:rPr>
-          <w:rFonts w:ascii="Arial" w:hAnsi="Arial" w:cs="Arial"/>
-          <w:color w:val="000000" w:themeColor="text1"/>
-          <w:sz w:val="24"/>
-          <w:szCs w:val="24"/>
-        </w:rPr>
-        <w:t xml:space="preserve"> e negativo</w:t>
-      </w:r>
-      <w:r>
-        <w:rPr>
-          <w:rFonts w:ascii="Arial" w:hAnsi="Arial" w:cs="Arial"/>
-          <w:color w:val="000000" w:themeColor="text1"/>
-          <w:sz w:val="24"/>
-          <w:szCs w:val="24"/>
-        </w:rPr>
-        <w:t xml:space="preserve"> (fluxo alternativo). Exemplo de cenário negativo: </w:t>
-      </w:r>
-      <w:r>
-        <w:rPr>
-          <w:rFonts w:ascii="Arial" w:hAnsi="Arial" w:cs="Arial"/>
-          <w:color w:val="000000" w:themeColor="text1"/>
-          <w:sz w:val="24"/>
-          <w:szCs w:val="24"/>
-        </w:rPr>
-        <w:lastRenderedPageBreak/>
-        <w:t xml:space="preserve">“Ao preencher com usuário e senha inválidos deve exibir uma mensagem de alerta...” </w:t>
-      </w:r>
-    </w:p>
-    <w:p>
-      <w:pPr>
-        <w:pStyle w:val="PargrafodaLista"/>
-        <w:numPr>
-          <w:ilvl w:val="0"/>
-          <w:numId w:val="17"/>
-        </w:numPr>
-        <w:rPr>
-          <w:rFonts w:ascii="Arial" w:hAnsi="Arial" w:cs="Arial"/>
-          <w:color w:val="000000" w:themeColor="text1"/>
-          <w:sz w:val="24"/>
-          <w:szCs w:val="24"/>
-        </w:rPr>
-      </w:pPr>
-      <w:r>
-        <w:rPr>
-          <w:rFonts w:ascii="Arial" w:hAnsi="Arial" w:cs="Arial"/>
-          <w:color w:val="000000" w:themeColor="text1"/>
-          <w:sz w:val="24"/>
-          <w:szCs w:val="24"/>
-        </w:rPr>
-        <w:t>Referência: Módulo 4</w:t>
-      </w:r>
-      <w:r>
-        <w:rPr>
-          <w:rFonts w:ascii="Arial" w:hAnsi="Arial" w:cs="Arial"/>
-          <w:color w:val="000000" w:themeColor="text1"/>
-          <w:sz w:val="24"/>
-          <w:szCs w:val="24"/>
-        </w:rPr>
-        <w:t xml:space="preserve"> e 5</w:t>
-      </w:r>
-    </w:p>
-    <w:p>
-      <w:pPr>
-        <w:rPr>
-          <w:rFonts w:ascii="Arial" w:hAnsi="Arial" w:cs="Arial"/>
-          <w:color w:val="000000" w:themeColor="text1"/>
-          <w:sz w:val="24"/>
-          <w:szCs w:val="24"/>
-        </w:rPr>
-      </w:pPr>
-    </w:p>
-    <w:p>
-      <w:pPr>
-        <w:pStyle w:val="Ttulo2"/>
-        <w:numPr>
-          <w:ilvl w:val="2"/>
-          <w:numId w:val="9"/>
-        </w:numPr>
-      </w:pPr>
-      <w:bookmarkStart w:id="10" w:name="_Toc85541179"/>
-      <w:r>
-        <w:t>História de usuário 1:</w:t>
-      </w:r>
-      <w:bookmarkEnd w:id="10"/>
-      <w:r>
-        <w:t xml:space="preserve"> </w:t>
-      </w:r>
-      <w:r>
-        <w:t>[US-0001] – Adicionar item ao carrinho</w:t>
-      </w:r>
-      <w:r>
-        <w:t xml:space="preserve">: </w:t>
-      </w:r>
-    </w:p>
-    <w:p>
-      <w:pPr>
-        <w:ind w:left="708"/>
-        <w:rPr>
-          <w:rFonts w:ascii="Arial" w:hAnsi="Arial" w:cs="Arial"/>
-          <w:color w:val="000000" w:themeColor="text1"/>
-          <w:sz w:val="24"/>
-          <w:szCs w:val="24"/>
-        </w:rPr>
-      </w:pPr>
-      <w:r>
-        <w:rPr>
-          <w:rFonts w:ascii="Arial" w:hAnsi="Arial" w:cs="Arial"/>
-          <w:color w:val="000000" w:themeColor="text1"/>
-          <w:sz w:val="24"/>
-          <w:szCs w:val="24"/>
-        </w:rPr>
-        <w:t>CT01:</w:t>
-      </w:r>
-      <w:r>
-        <w:rPr>
-          <w:rFonts w:ascii="Arial" w:hAnsi="Arial" w:cs="Arial"/>
-          <w:color w:val="000000" w:themeColor="text1"/>
-          <w:sz w:val="24"/>
-          <w:szCs w:val="24"/>
-        </w:rPr>
-        <w:t>Deve selecionar um produto da lista;</w:t>
-      </w:r>
-    </w:p>
-    <w:p>
-      <w:pPr>
-        <w:ind w:left="708"/>
-        <w:rPr>
-          <w:rFonts w:ascii="Arial" w:hAnsi="Arial" w:cs="Arial"/>
-          <w:color w:val="000000" w:themeColor="text1"/>
-          <w:sz w:val="24"/>
-          <w:szCs w:val="24"/>
-        </w:rPr>
-      </w:pPr>
-      <w:r>
-        <w:rPr>
-          <w:rFonts w:ascii="Arial" w:hAnsi="Arial" w:cs="Arial"/>
-          <w:color w:val="000000" w:themeColor="text1"/>
-          <w:sz w:val="24"/>
-          <w:szCs w:val="24"/>
-        </w:rPr>
-        <w:t>CT02:</w:t>
-      </w:r>
-    </w:p>
-    <w:p>
-      <w:pPr>
-        <w:ind w:left="708"/>
-        <w:rPr>
-          <w:rFonts w:ascii="Arial" w:hAnsi="Arial" w:cs="Arial"/>
-          <w:color w:val="000000" w:themeColor="text1"/>
-          <w:sz w:val="24"/>
-          <w:szCs w:val="24"/>
-        </w:rPr>
-      </w:pPr>
-      <w:r>
-        <w:rPr>
-          <w:rFonts w:ascii="Arial" w:hAnsi="Arial" w:cs="Arial"/>
-          <w:color w:val="000000" w:themeColor="text1"/>
-          <w:sz w:val="24"/>
-          <w:szCs w:val="24"/>
-        </w:rPr>
-        <w:t>CT03:</w:t>
-      </w:r>
-      <w:r>
-        <w:rPr>
-          <w:rFonts w:ascii="Arial" w:hAnsi="Arial" w:cs="Arial"/>
-          <w:color w:val="000000" w:themeColor="text1"/>
-          <w:sz w:val="24"/>
-          <w:szCs w:val="24"/>
-        </w:rPr>
-        <w:br/>
-      </w:r>
-    </w:p>
-    <w:p>
-      <w:pPr>
-        <w:pStyle w:val="Ttulo2"/>
-        <w:numPr>
-          <w:ilvl w:val="2"/>
-          <w:numId w:val="9"/>
-        </w:numPr>
-      </w:pPr>
-      <w:bookmarkStart w:id="11" w:name="_Toc85541180"/>
-      <w:r>
-        <w:t>História de usuário 2:</w:t>
-      </w:r>
-      <w:bookmarkEnd w:id="11"/>
-      <w:r>
-        <w:t xml:space="preserve"> </w:t>
-      </w:r>
-    </w:p>
-    <w:p>
-      <w:pPr>
-        <w:ind w:left="708"/>
-        <w:rPr>
-          <w:rFonts w:ascii="Arial" w:hAnsi="Arial" w:cs="Arial"/>
-          <w:color w:val="000000" w:themeColor="text1"/>
-          <w:sz w:val="24"/>
-          <w:szCs w:val="24"/>
-        </w:rPr>
-      </w:pPr>
-      <w:r>
-        <w:rPr>
-          <w:rFonts w:ascii="Arial" w:hAnsi="Arial" w:cs="Arial"/>
-          <w:color w:val="000000" w:themeColor="text1"/>
-          <w:sz w:val="24"/>
-          <w:szCs w:val="24"/>
-        </w:rPr>
-        <w:t>CT01:</w:t>
-      </w:r>
-    </w:p>
-    <w:p>
-      <w:pPr>
-        <w:ind w:left="708"/>
-        <w:rPr>
-          <w:rFonts w:ascii="Arial" w:hAnsi="Arial" w:cs="Arial"/>
-          <w:color w:val="000000" w:themeColor="text1"/>
-          <w:sz w:val="24"/>
-          <w:szCs w:val="24"/>
-        </w:rPr>
-      </w:pPr>
-      <w:r>
-        <w:rPr>
-          <w:rFonts w:ascii="Arial" w:hAnsi="Arial" w:cs="Arial"/>
-          <w:color w:val="000000" w:themeColor="text1"/>
-          <w:sz w:val="24"/>
-          <w:szCs w:val="24"/>
-        </w:rPr>
-        <w:t>CT02:</w:t>
-      </w:r>
-    </w:p>
-    <w:p>
-      <w:pPr>
-        <w:ind w:left="708"/>
-        <w:rPr>
-          <w:rFonts w:ascii="Arial" w:hAnsi="Arial" w:cs="Arial"/>
-          <w:color w:val="000000" w:themeColor="text1"/>
-          <w:sz w:val="24"/>
-          <w:szCs w:val="24"/>
-        </w:rPr>
-      </w:pPr>
-      <w:r>
-        <w:rPr>
-          <w:rFonts w:ascii="Arial" w:hAnsi="Arial" w:cs="Arial"/>
-          <w:color w:val="000000" w:themeColor="text1"/>
-          <w:sz w:val="24"/>
-          <w:szCs w:val="24"/>
-        </w:rPr>
-        <w:t>CT03:</w:t>
-      </w:r>
-    </w:p>
-    <w:p>
-      <w:pPr>
-        <w:ind w:left="708"/>
-        <w:rPr>
-          <w:rFonts w:ascii="Arial" w:hAnsi="Arial" w:cs="Arial"/>
-          <w:color w:val="000000" w:themeColor="text1"/>
-          <w:sz w:val="24"/>
-          <w:szCs w:val="24"/>
-        </w:rPr>
-      </w:pPr>
-    </w:p>
-    <w:p>
-      <w:pPr>
-        <w:pStyle w:val="Ttulo2"/>
-        <w:numPr>
-          <w:ilvl w:val="2"/>
-          <w:numId w:val="16"/>
-        </w:numPr>
-      </w:pPr>
-      <w:bookmarkStart w:id="12" w:name="_Toc85541181"/>
-      <w:r>
-        <w:t xml:space="preserve">História de usuário 3: </w:t>
-      </w:r>
-      <w:r>
-        <w:t>API de Cupom</w:t>
-      </w:r>
-      <w:bookmarkEnd w:id="12"/>
-    </w:p>
-    <w:p>
-      <w:pPr>
-        <w:ind w:left="708"/>
-        <w:rPr>
-          <w:rFonts w:ascii="Arial" w:hAnsi="Arial" w:cs="Arial"/>
-          <w:color w:val="000000" w:themeColor="text1"/>
-          <w:sz w:val="24"/>
-          <w:szCs w:val="24"/>
-        </w:rPr>
-      </w:pPr>
-      <w:r>
-        <w:rPr>
-          <w:rFonts w:ascii="Arial" w:hAnsi="Arial" w:cs="Arial"/>
-          <w:color w:val="000000" w:themeColor="text1"/>
-          <w:sz w:val="24"/>
-          <w:szCs w:val="24"/>
-        </w:rPr>
-        <w:t>CT01:</w:t>
-      </w:r>
-    </w:p>
-    <w:p>
-      <w:pPr>
-        <w:ind w:left="708"/>
-        <w:rPr>
-          <w:rFonts w:ascii="Arial" w:hAnsi="Arial" w:cs="Arial"/>
-          <w:color w:val="000000" w:themeColor="text1"/>
-          <w:sz w:val="24"/>
-          <w:szCs w:val="24"/>
-        </w:rPr>
-      </w:pPr>
-      <w:r>
-        <w:rPr>
-          <w:rFonts w:ascii="Arial" w:hAnsi="Arial" w:cs="Arial"/>
-          <w:color w:val="000000" w:themeColor="text1"/>
-          <w:sz w:val="24"/>
-          <w:szCs w:val="24"/>
-        </w:rPr>
-        <w:t>CT02:</w:t>
-      </w:r>
-    </w:p>
-    <w:p>
-      <w:pPr>
-        <w:ind w:left="708"/>
-        <w:rPr>
-          <w:rFonts w:ascii="Arial" w:hAnsi="Arial" w:cs="Arial"/>
-          <w:color w:val="000000" w:themeColor="text1"/>
-          <w:sz w:val="24"/>
-          <w:szCs w:val="24"/>
-        </w:rPr>
-      </w:pPr>
-      <w:r>
-        <w:rPr>
-          <w:rFonts w:ascii="Arial" w:hAnsi="Arial" w:cs="Arial"/>
-          <w:color w:val="000000" w:themeColor="text1"/>
-          <w:sz w:val="24"/>
-          <w:szCs w:val="24"/>
-        </w:rPr>
-        <w:t>CT03:</w:t>
-      </w:r>
-    </w:p>
-    <w:p>
-      <w:pPr>
-        <w:rPr>
-          <w:rFonts w:ascii="Arial" w:hAnsi="Arial" w:cs="Arial"/>
-          <w:color w:val="000000" w:themeColor="text1"/>
-          <w:sz w:val="24"/>
-          <w:szCs w:val="24"/>
-        </w:rPr>
-      </w:pPr>
-    </w:p>
-    <w:p>
-      <w:pPr>
-        <w:pStyle w:val="Ttulo2"/>
-      </w:pPr>
-      <w:r>
-        <w:t xml:space="preserve"> </w:t>
-      </w:r>
-      <w:bookmarkStart w:id="13" w:name="_Toc85541182"/>
-      <w:r>
-        <w:t>Repositório no Github</w:t>
-      </w:r>
-      <w:bookmarkEnd w:id="13"/>
-    </w:p>
-    <w:p>
-      <w:pPr>
-        <w:pStyle w:val="PargrafodaLista"/>
-        <w:numPr>
-          <w:ilvl w:val="0"/>
-          <w:numId w:val="22"/>
-        </w:numPr>
-        <w:rPr>
-          <w:rFonts w:ascii="Arial" w:hAnsi="Arial" w:cs="Arial"/>
-          <w:color w:val="000000" w:themeColor="text1"/>
-          <w:sz w:val="24"/>
-          <w:szCs w:val="24"/>
-        </w:rPr>
-      </w:pPr>
-      <w:r>
-        <w:rPr>
-          <w:rFonts w:ascii="Arial" w:hAnsi="Arial" w:cs="Arial"/>
-          <w:color w:val="000000" w:themeColor="text1"/>
-          <w:sz w:val="24"/>
-          <w:szCs w:val="24"/>
-        </w:rPr>
-        <w:t>Crie um repositório no github com o nome TCC-EBAC</w:t>
-      </w:r>
-      <w:r>
-        <w:rPr>
-          <w:rFonts w:ascii="Arial" w:hAnsi="Arial" w:cs="Arial"/>
-          <w:color w:val="000000" w:themeColor="text1"/>
-          <w:sz w:val="24"/>
-          <w:szCs w:val="24"/>
-        </w:rPr>
-        <w:t>;</w:t>
-      </w:r>
-    </w:p>
-    <w:p>
-      <w:pPr>
-        <w:pStyle w:val="PargrafodaLista"/>
-        <w:numPr>
-          <w:ilvl w:val="0"/>
-          <w:numId w:val="22"/>
-        </w:numPr>
-        <w:rPr>
-          <w:rFonts w:ascii="Arial" w:hAnsi="Arial" w:cs="Arial"/>
-          <w:color w:val="000000" w:themeColor="text1"/>
-          <w:sz w:val="24"/>
-          <w:szCs w:val="24"/>
-        </w:rPr>
-      </w:pPr>
-      <w:r>
-        <w:rPr>
-          <w:rFonts w:ascii="Arial" w:hAnsi="Arial" w:cs="Arial"/>
-          <w:color w:val="000000" w:themeColor="text1"/>
-          <w:sz w:val="24"/>
-          <w:szCs w:val="24"/>
-        </w:rPr>
-        <w:t>Deixe o repositório publico até a análise dos tutores;</w:t>
-      </w:r>
-    </w:p>
-    <w:p>
-      <w:pPr>
-        <w:pStyle w:val="PargrafodaLista"/>
-        <w:numPr>
-          <w:ilvl w:val="0"/>
-          <w:numId w:val="22"/>
-        </w:numPr>
-        <w:rPr>
-          <w:rFonts w:ascii="Arial" w:hAnsi="Arial" w:cs="Arial"/>
-          <w:color w:val="000000" w:themeColor="text1"/>
-          <w:sz w:val="24"/>
-          <w:szCs w:val="24"/>
-        </w:rPr>
-      </w:pPr>
-      <w:r>
-        <w:rPr>
-          <w:rFonts w:ascii="Arial" w:hAnsi="Arial" w:cs="Arial"/>
-          <w:color w:val="000000" w:themeColor="text1"/>
-          <w:sz w:val="24"/>
-          <w:szCs w:val="24"/>
-        </w:rPr>
-        <w:t>Neste repositório você deve subir este arquivo e todos os código fontes da automação WEB, API, Mobile, Performance e CI.</w:t>
-      </w:r>
-    </w:p>
-    <w:p>
-      <w:pPr>
-        <w:pStyle w:val="PargrafodaLista"/>
-        <w:numPr>
-          <w:ilvl w:val="0"/>
-          <w:numId w:val="17"/>
-        </w:numPr>
-        <w:rPr>
-          <w:rFonts w:ascii="Arial" w:hAnsi="Arial" w:cs="Arial"/>
-          <w:color w:val="000000" w:themeColor="text1"/>
-          <w:sz w:val="24"/>
-          <w:szCs w:val="24"/>
-        </w:rPr>
-      </w:pPr>
-      <w:r>
-        <w:rPr>
-          <w:rFonts w:ascii="Arial" w:hAnsi="Arial" w:cs="Arial"/>
-          <w:color w:val="000000" w:themeColor="text1"/>
-          <w:sz w:val="24"/>
-          <w:szCs w:val="24"/>
-        </w:rPr>
-        <w:t>Referência: Módulo 10</w:t>
-      </w:r>
-    </w:p>
-    <w:p>
-      <w:pPr>
-        <w:pStyle w:val="PargrafodaLista"/>
-        <w:numPr>
-          <w:ilvl w:val="0"/>
-          <w:numId w:val="17"/>
-        </w:numPr>
-        <w:rPr>
-          <w:rFonts w:ascii="Arial" w:hAnsi="Arial" w:cs="Arial"/>
-          <w:color w:val="000000" w:themeColor="text1"/>
-          <w:sz w:val="24"/>
-          <w:szCs w:val="24"/>
-        </w:rPr>
-      </w:pPr>
-      <w:r>
-        <w:rPr>
-          <w:rFonts w:ascii="Arial" w:hAnsi="Arial" w:cs="Arial"/>
-          <w:color w:val="000000" w:themeColor="text1"/>
-          <w:sz w:val="24"/>
-          <w:szCs w:val="24"/>
-        </w:rPr>
         <w:t xml:space="preserve">Link do repositório: </w:t>
       </w:r>
       <w:r>
@@ -6234,108 +6280,70 @@
     <w:p>
       <w:pPr>
         <w:pStyle w:val="PargrafodaLista"/>
+        <w:ind w:left="1800"/>
+        <w:rPr>
+          <w:rFonts w:ascii="Arial" w:hAnsi="Arial" w:cs="Arial"/>
+          <w:color w:val="000000" w:themeColor="text1"/>
+          <w:sz w:val="24"/>
+          <w:szCs w:val="24"/>
+        </w:rPr>
+      </w:pPr>
+    </w:p>
+    <w:p>
+      <w:pPr>
+        <w:pStyle w:val="FirstParagraph"/>
         <w:numPr>
           <w:ilvl w:val="0"/>
           <w:numId w:val="19"/>
         </w:numPr>
         <w:rPr>
-          <w:rFonts w:ascii="Arial" w:hAnsi="Arial" w:cs="Arial"/>
-          <w:color w:val="000000" w:themeColor="text1"/>
-          <w:sz w:val="24"/>
-          <w:szCs w:val="24"/>
-        </w:rPr>
-      </w:pPr>
-      <w:r>
-        <w:rPr>
-          <w:rFonts w:ascii="Arial" w:hAnsi="Arial" w:cs="Arial"/>
-          <w:color w:val="000000" w:themeColor="text1"/>
-          <w:sz w:val="24"/>
-          <w:szCs w:val="24"/>
-        </w:rPr>
-        <w:t>Crie um projeto de automação no Cypress</w:t>
-      </w:r>
-      <w:r>
-        <w:rPr>
-          <w:rFonts w:ascii="Arial" w:hAnsi="Arial" w:cs="Arial"/>
-          <w:color w:val="000000" w:themeColor="text1"/>
-          <w:sz w:val="24"/>
-          <w:szCs w:val="24"/>
-        </w:rPr>
-        <w:t>;</w:t>
-      </w:r>
-    </w:p>
-    <w:p>
-      <w:pPr>
-        <w:pStyle w:val="PargrafodaLista"/>
+          <w:rFonts w:asciiTheme="minorBidi" w:hAnsiTheme="minorBidi"/>
+          <w:lang w:val="pt-BR"/>
+        </w:rPr>
+      </w:pPr>
+      <w:r>
+        <w:rPr>
+          <w:rFonts w:asciiTheme="minorBidi" w:hAnsiTheme="minorBidi"/>
+          <w:lang w:val="pt-BR"/>
+        </w:rPr>
+        <w:t>Automação de UI: - cadastro.cy.js - login.cy.js - produtos.cy.js</w:t>
+      </w:r>
+      <w:r>
+        <w:rPr>
+          <w:rFonts w:asciiTheme="minorBidi" w:hAnsiTheme="minorBidi"/>
+          <w:lang w:val="pt-BR"/>
+        </w:rPr>
+        <w:t>.</w:t>
+      </w:r>
+    </w:p>
+    <w:p>
+      <w:pPr>
+        <w:pStyle w:val="Corpodetexto"/>
         <w:numPr>
           <w:ilvl w:val="0"/>
           <w:numId w:val="19"/>
         </w:numPr>
         <w:rPr>
-          <w:rFonts w:ascii="Arial" w:hAnsi="Arial" w:cs="Arial"/>
-          <w:color w:val="000000" w:themeColor="text1"/>
-          <w:sz w:val="24"/>
-          <w:szCs w:val="24"/>
-        </w:rPr>
-      </w:pPr>
-      <w:r>
-        <w:rPr>
-          <w:rFonts w:ascii="Arial" w:hAnsi="Arial" w:cs="Arial"/>
-          <w:color w:val="000000" w:themeColor="text1"/>
-          <w:sz w:val="24"/>
-          <w:szCs w:val="24"/>
-        </w:rPr>
-        <w:t>Crie uma pasta chamada UI para os testes WEB da História de Usuário</w:t>
-      </w:r>
-      <w:r>
-        <w:rPr>
-          <w:rFonts w:ascii="Arial" w:hAnsi="Arial" w:cs="Arial"/>
-          <w:color w:val="000000" w:themeColor="text1"/>
-          <w:sz w:val="24"/>
-          <w:szCs w:val="24"/>
-        </w:rPr>
-        <w:t xml:space="preserve"> </w:t>
-      </w:r>
-      <w:r>
-        <w:rPr>
-          <w:rFonts w:ascii="Arial" w:hAnsi="Arial" w:cs="Arial"/>
-          <w:color w:val="000000" w:themeColor="text1"/>
-          <w:sz w:val="24"/>
-          <w:szCs w:val="24"/>
-        </w:rPr>
-        <w:t>[US-0001] – Adicionar item ao carrinho;</w:t>
-      </w:r>
-    </w:p>
-    <w:p>
-      <w:pPr>
-        <w:pStyle w:val="PargrafodaLista"/>
-        <w:numPr>
-          <w:ilvl w:val="0"/>
-          <w:numId w:val="19"/>
-        </w:numPr>
-        <w:rPr>
-          <w:rFonts w:ascii="Arial" w:hAnsi="Arial" w:cs="Arial"/>
-          <w:color w:val="000000" w:themeColor="text1"/>
-          <w:sz w:val="24"/>
-          <w:szCs w:val="24"/>
-        </w:rPr>
-      </w:pPr>
-      <w:r>
-        <w:rPr>
-          <w:rFonts w:ascii="Arial" w:hAnsi="Arial" w:cs="Arial"/>
-          <w:color w:val="000000" w:themeColor="text1"/>
-          <w:sz w:val="24"/>
-          <w:szCs w:val="24"/>
-        </w:rPr>
-        <w:lastRenderedPageBreak/>
-        <w:t>Na automação deve adicionar pelo menos 3 produtos diferentes e validar se os itens foram adicionados com sucesso.</w:t>
-      </w:r>
-    </w:p>
-    <w:p>
-      <w:pPr>
-        <w:rPr>
-          <w:rFonts w:ascii="Arial" w:hAnsi="Arial" w:cs="Arial"/>
-          <w:color w:val="000000" w:themeColor="text1"/>
+          <w:rFonts w:asciiTheme="minorBidi" w:hAnsiTheme="minorBidi"/>
+          <w:sz w:val="24"/>
+          <w:szCs w:val="24"/>
+        </w:rPr>
+      </w:pPr>
+      <w:r>
+        <w:rPr>
+          <w:rFonts w:asciiTheme="minorBidi" w:hAnsiTheme="minorBidi"/>
+          <w:sz w:val="24"/>
+          <w:szCs w:val="24"/>
+        </w:rPr>
+        <w:t>Automação de API: - login.api.cy.js - produtos.api.cy.js - cupons.api.cy.js</w:t>
+      </w:r>
+    </w:p>
+    <w:p>
+      <w:pPr>
+        <w:pStyle w:val="Corpodetexto"/>
+        <w:ind w:left="1428"/>
+        <w:rPr>
+          <w:rFonts w:asciiTheme="minorBidi" w:hAnsiTheme="minorBidi"/>
           <w:sz w:val="24"/>
           <w:szCs w:val="24"/>
         </w:rPr>
@@ -6923,6 +6931,7 @@
           <w:szCs w:val="18"/>
           <w:lang w:eastAsia="pt-BR"/>
         </w:rPr>
+        <w:lastRenderedPageBreak/>
         <w:t xml:space="preserve">            </w:t>
       </w:r>
       <w:r>
@@ -7322,213 +7331,63 @@
         <w:t xml:space="preserve">    });</w:t>
       </w:r>
     </w:p>
-    <w:p>
-      <w:pPr>
-        <w:rPr>
-          <w:rFonts w:ascii="Arial" w:hAnsi="Arial" w:cs="Arial"/>
-          <w:color w:val="000000" w:themeColor="text1"/>
-          <w:sz w:val="24"/>
-          <w:szCs w:val="24"/>
-        </w:rPr>
-      </w:pPr>
+    <w:p/>
+    <w:p>
+      <w:pPr>
+        <w:pStyle w:val="Ttulo2"/>
+      </w:pPr>
+      <w:r>
+        <w:t xml:space="preserve"> </w:t>
+      </w:r>
+      <w:bookmarkStart w:id="15" w:name="_Toc85541184"/>
+      <w:r>
+        <w:t>Integração contínua</w:t>
+      </w:r>
+      <w:bookmarkEnd w:id="15"/>
     </w:p>
     <w:p>
       <w:pPr>
         <w:pStyle w:val="PargrafodaLista"/>
-        <w:numPr>
-          <w:ilvl w:val="0"/>
-          <w:numId w:val="25"/>
-        </w:numPr>
-        <w:rPr>
-          <w:rFonts w:ascii="Arial" w:hAnsi="Arial" w:cs="Arial"/>
-          <w:color w:val="000000" w:themeColor="text1"/>
-          <w:sz w:val="24"/>
-          <w:szCs w:val="24"/>
-        </w:rPr>
-      </w:pPr>
-      <w:r>
-        <w:rPr>
-          <w:rFonts w:ascii="Arial" w:hAnsi="Arial" w:cs="Arial"/>
-          <w:color w:val="000000" w:themeColor="text1"/>
-          <w:sz w:val="24"/>
-          <w:szCs w:val="24"/>
-        </w:rPr>
-        <w:t xml:space="preserve">Obs.: </w:t>
-      </w:r>
-      <w:r>
-        <w:rPr>
-          <w:rFonts w:ascii="Arial" w:hAnsi="Arial" w:cs="Arial"/>
-          <w:color w:val="000000" w:themeColor="text1"/>
-          <w:sz w:val="24"/>
-          <w:szCs w:val="24"/>
-        </w:rPr>
-        <w:t>Considere todas as boas práticas de otimização de cenários (Page Objects, Massa de dados, Custom Commands, elementos etc.).</w:t>
-      </w:r>
-    </w:p>
-    <w:p>
-      <w:pPr>
-        <w:pStyle w:val="PargrafodaLista"/>
-        <w:numPr>
-          <w:ilvl w:val="0"/>
-          <w:numId w:val="17"/>
-        </w:numPr>
-        <w:rPr>
-          <w:rFonts w:ascii="Arial" w:hAnsi="Arial" w:cs="Arial"/>
-          <w:color w:val="000000" w:themeColor="text1"/>
-          <w:sz w:val="24"/>
-          <w:szCs w:val="24"/>
-        </w:rPr>
-      </w:pPr>
-      <w:r>
-        <w:rPr>
-          <w:rFonts w:ascii="Arial" w:hAnsi="Arial" w:cs="Arial"/>
-          <w:color w:val="000000" w:themeColor="text1"/>
-          <w:sz w:val="24"/>
-          <w:szCs w:val="24"/>
-        </w:rPr>
-        <w:t>Referência: Módulo 1</w:t>
-      </w:r>
-      <w:r>
-        <w:rPr>
-          <w:rFonts w:ascii="Arial" w:hAnsi="Arial" w:cs="Arial"/>
-          <w:color w:val="000000" w:themeColor="text1"/>
-          <w:sz w:val="24"/>
-          <w:szCs w:val="24"/>
-        </w:rPr>
-        <w:t>1, 12 e 14</w:t>
-      </w:r>
-    </w:p>
-    <w:p/>
-    <w:p>
-      <w:pPr>
-        <w:pStyle w:val="Ttulo2"/>
-      </w:pPr>
-      <w:r>
-        <w:t xml:space="preserve"> </w:t>
-      </w:r>
-      <w:bookmarkStart w:id="15" w:name="_Toc85541184"/>
-      <w:r>
-        <w:t>Integração contínua</w:t>
-      </w:r>
-      <w:bookmarkEnd w:id="15"/>
-    </w:p>
-    <w:p>
-      <w:pPr>
-        <w:pStyle w:val="PargrafodaLista"/>
-        <w:numPr>
-          <w:ilvl w:val="0"/>
-          <w:numId w:val="17"/>
-        </w:numPr>
-        <w:rPr>
-          <w:rFonts w:ascii="Arial" w:hAnsi="Arial" w:cs="Arial"/>
-          <w:color w:val="000000" w:themeColor="text1"/>
-          <w:sz w:val="24"/>
-          <w:szCs w:val="24"/>
-        </w:rPr>
-      </w:pPr>
-      <w:r>
-        <w:rPr>
-          <w:rFonts w:ascii="Arial" w:hAnsi="Arial" w:cs="Arial"/>
-          <w:color w:val="000000" w:themeColor="text1"/>
-          <w:sz w:val="24"/>
-          <w:szCs w:val="24"/>
-        </w:rPr>
-        <w:t>Coloque os testes automatizados na integração contínua com jenkins</w:t>
-      </w:r>
-      <w:r>
-        <w:rPr>
-          <w:rFonts w:ascii="Arial" w:hAnsi="Arial" w:cs="Arial"/>
-          <w:color w:val="000000" w:themeColor="text1"/>
-          <w:sz w:val="24"/>
-          <w:szCs w:val="24"/>
-        </w:rPr>
-        <w:t>, criando um job para execução da sua automação</w:t>
-      </w:r>
-      <w:r>
-        <w:rPr>
-          <w:rFonts w:ascii="Arial" w:hAnsi="Arial" w:cs="Arial"/>
-          <w:color w:val="000000" w:themeColor="text1"/>
-          <w:sz w:val="24"/>
-          <w:szCs w:val="24"/>
-        </w:rPr>
-        <w:t>;</w:t>
-      </w:r>
-    </w:p>
-    <w:p>
-      <w:pPr>
-        <w:pStyle w:val="PargrafodaLista"/>
-        <w:numPr>
-          <w:ilvl w:val="0"/>
-          <w:numId w:val="17"/>
-        </w:numPr>
-        <w:rPr>
-          <w:rFonts w:ascii="Arial" w:hAnsi="Arial" w:cs="Arial"/>
-          <w:color w:val="000000" w:themeColor="text1"/>
-          <w:sz w:val="24"/>
-          <w:szCs w:val="24"/>
-        </w:rPr>
-      </w:pPr>
-      <w:r>
-        <w:rPr>
-          <w:rFonts w:ascii="Arial" w:hAnsi="Arial" w:cs="Arial"/>
-          <w:color w:val="000000" w:themeColor="text1"/>
-          <w:sz w:val="24"/>
-          <w:szCs w:val="24"/>
-        </w:rPr>
-        <w:t xml:space="preserve">Compartilhe o </w:t>
-      </w:r>
-      <w:r>
-        <w:rPr>
-          <w:rFonts w:ascii="Arial" w:hAnsi="Arial" w:cs="Arial"/>
-          <w:i/>
-          <w:iCs/>
-          <w:color w:val="000000" w:themeColor="text1"/>
-          <w:sz w:val="24"/>
-          <w:szCs w:val="24"/>
-        </w:rPr>
-        <w:t xml:space="preserve">jenkinsfile </w:t>
-      </w:r>
-      <w:r>
-        <w:rPr>
-          <w:rFonts w:ascii="Arial" w:hAnsi="Arial" w:cs="Arial"/>
-          <w:color w:val="000000" w:themeColor="text1"/>
-          <w:sz w:val="24"/>
-          <w:szCs w:val="24"/>
-        </w:rPr>
-        <w:t xml:space="preserve">no repositório, junto ao seu projeto. </w:t>
-      </w:r>
-    </w:p>
-    <w:p>
-      <w:pPr>
-        <w:pStyle w:val="PargrafodaLista"/>
-        <w:numPr>
-          <w:ilvl w:val="0"/>
-          <w:numId w:val="17"/>
-        </w:numPr>
-        <w:rPr>
-          <w:rFonts w:ascii="Arial" w:hAnsi="Arial" w:cs="Arial"/>
-          <w:color w:val="000000" w:themeColor="text1"/>
-          <w:sz w:val="24"/>
-          <w:szCs w:val="24"/>
-        </w:rPr>
-      </w:pPr>
-      <w:r>
-        <w:rPr>
-          <w:rFonts w:ascii="Arial" w:hAnsi="Arial" w:cs="Arial"/>
-          <w:color w:val="000000" w:themeColor="text1"/>
-          <w:sz w:val="24"/>
-          <w:szCs w:val="24"/>
-        </w:rPr>
-        <w:t xml:space="preserve">Referência: Módulo </w:t>
-      </w:r>
-      <w:r>
-        <w:rPr>
-          <w:rFonts w:ascii="Arial" w:hAnsi="Arial" w:cs="Arial"/>
-          <w:color w:val="000000" w:themeColor="text1"/>
-          <w:sz w:val="24"/>
-          <w:szCs w:val="24"/>
-        </w:rPr>
-        <w:t>15</w:t>
+        <w:rPr>
+          <w:rFonts w:ascii="Arial" w:hAnsi="Arial" w:cs="Arial"/>
+          <w:color w:val="000000" w:themeColor="text1"/>
+          <w:sz w:val="24"/>
+          <w:szCs w:val="24"/>
+        </w:rPr>
+      </w:pPr>
+    </w:p>
+    <w:p>
+      <w:pPr>
+        <w:pStyle w:val="FirstParagraph"/>
+        <w:ind w:left="720"/>
+        <w:jc w:val="both"/>
+        <w:rPr>
+          <w:rFonts w:ascii="Arial" w:hAnsi="Arial" w:cs="Arial"/>
+          <w:lang w:val="pt-BR"/>
+        </w:rPr>
+      </w:pPr>
+      <w:r>
+        <w:rPr>
+          <w:rFonts w:ascii="Arial" w:hAnsi="Arial" w:cs="Arial"/>
+          <w:lang w:val="pt-BR"/>
+        </w:rPr>
+        <w:t xml:space="preserve">O projeto utiliza pipeline descrita em </w:t>
+      </w:r>
+      <w:proofErr w:type="spellStart"/>
+      <w:r>
+        <w:rPr>
+          <w:rFonts w:ascii="Arial" w:hAnsi="Arial" w:cs="Arial"/>
+          <w:lang w:val="pt-BR"/>
+        </w:rPr>
+        <w:t>Jenkinsfile</w:t>
+      </w:r>
+      <w:proofErr w:type="spellEnd"/>
+      <w:r>
+        <w:rPr>
+          <w:rFonts w:ascii="Arial" w:hAnsi="Arial" w:cs="Arial"/>
+          <w:lang w:val="pt-BR"/>
+        </w:rPr>
+        <w:t xml:space="preserve"> para instalação de dependências, execução dos testes e publicação de relatórios.</w:t>
       </w:r>
     </w:p>
     <w:p>
@@ -7742,6 +7601,17 @@
     </w:p>
     <w:p>
       <w:pPr>
+        <w:ind w:left="360"/>
+        <w:rPr>
+          <w:rFonts w:ascii="Arial" w:hAnsi="Arial" w:cs="Arial"/>
+          <w:color w:val="000000" w:themeColor="text1"/>
+          <w:sz w:val="24"/>
+          <w:szCs w:val="24"/>
+        </w:rPr>
+      </w:pPr>
+    </w:p>
+    <w:p>
+      <w:pPr>
         <w:pStyle w:val="PargrafodaLista"/>
         <w:numPr>
           <w:ilvl w:val="0"/>
@@ -7761,30 +7631,6 @@
           <w:sz w:val="24"/>
           <w:szCs w:val="24"/>
         </w:rPr>
-        <w:t>Referência: Módulo 18</w:t>
-      </w:r>
-    </w:p>
-    <w:p>
-      <w:pPr>
-        <w:pStyle w:val="PargrafodaLista"/>
-        <w:numPr>
-          <w:ilvl w:val="0"/>
-          <w:numId w:val="23"/>
-        </w:numPr>
-        <w:rPr>
-          <w:rFonts w:ascii="Arial" w:hAnsi="Arial" w:cs="Arial"/>
-          <w:color w:val="000000" w:themeColor="text1"/>
-          <w:sz w:val="24"/>
-          <w:szCs w:val="24"/>
-        </w:rPr>
-      </w:pPr>
-      <w:r>
-        <w:rPr>
-          <w:rFonts w:ascii="Arial" w:hAnsi="Arial" w:cs="Arial"/>
-          <w:color w:val="000000" w:themeColor="text1"/>
-          <w:sz w:val="24"/>
-          <w:szCs w:val="24"/>
-        </w:rPr>
         <w:t xml:space="preserve">Configurações do teste de performance: </w:t>
       </w:r>
       <w:r>
@@ -7814,7 +7660,6 @@
           <w:sz w:val="24"/>
           <w:szCs w:val="24"/>
         </w:rPr>
-        <w:lastRenderedPageBreak/>
         <w:t>-Usuários</w:t>
       </w:r>
       <w:r>
@@ -8264,7 +8109,7 @@
                     <pic:cNvPicPr/>
                   </pic:nvPicPr>
                   <pic:blipFill>
-                    <a:blip r:embed="rId11">
+                    <a:blip r:embed="rId8">
                       <a:extLst>
                         <a:ext uri="{28A0092B-C50C-407E-A947-70E740481C1C}">
                           <a14:useLocalDpi xmlns:a14="http://schemas.microsoft.com/office/drawing/2010/main" val="0"/>
@@ -8323,6 +8168,7 @@
           <w:sz w:val="24"/>
           <w:szCs w:val="24"/>
         </w:rPr>
+        <w:lastRenderedPageBreak/>
         <w:t xml:space="preserve">DICA: </w:t>
       </w:r>
       <w:r>
@@ -8369,7 +8215,7 @@
                     <pic:cNvPicPr/>
                   </pic:nvPicPr>
                   <pic:blipFill>
-                    <a:blip r:embed="rId12">
+                    <a:blip r:embed="rId9">
                       <a:extLst>
                         <a:ext uri="{28A0092B-C50C-407E-A947-70E740481C1C}">
                           <a14:useLocalDpi xmlns:a14="http://schemas.microsoft.com/office/drawing/2010/main" val="0"/>
@@ -8443,7 +8289,7 @@
           <w:sz w:val="24"/>
           <w:szCs w:val="24"/>
         </w:rPr>
-        <w:t xml:space="preserve">Coloque sua experiência na realização do trabalho, o que aprendeu, quais lições pode aplicar </w:t>
+        <w:t>A execução deste projeto foi bastante desafiadora e, ao mesmo tempo, muito enriquecedora para a minha vida profissional e minha formação em qualidade de software.</w:t>
       </w:r>
       <w:r>
         <w:rPr>
@@ -8452,7 +8298,8 @@
           <w:sz w:val="24"/>
           <w:szCs w:val="24"/>
         </w:rPr>
-        <w:t>em sua</w:t>
+        <w:tab/>
+        <w:t>Ao longo do projeto, consegui aplicar de forma prática os principais conceitos de QA aprendidos nas aulas, iniciando pelo planejamento</w:t>
       </w:r>
       <w:r>
         <w:rPr>
@@ -8461,8 +8308,9 @@
           <w:sz w:val="24"/>
           <w:szCs w:val="24"/>
         </w:rPr>
-        <w:t xml:space="preserve"> vida pr</w:t>
-      </w:r>
+        <w:t xml:space="preserve">, definição de estratégias de testes, elaboração de histórias de usuários e critérios de aceitação, até a estruturação do ambiente no Visual Studio </w:t>
+      </w:r>
+      <w:proofErr w:type="spellStart"/>
       <w:r>
         <w:rPr>
           <w:rFonts w:ascii="Arial" w:eastAsia="Arial" w:hAnsi="Arial" w:cs="Arial"/>
@@ -8470,8 +8318,9 @@
           <w:sz w:val="24"/>
           <w:szCs w:val="24"/>
         </w:rPr>
-        <w:t>o</w:t>
-      </w:r>
+        <w:t>Code</w:t>
+      </w:r>
+      <w:proofErr w:type="spellEnd"/>
       <w:r>
         <w:rPr>
           <w:rFonts w:ascii="Arial" w:eastAsia="Arial" w:hAnsi="Arial" w:cs="Arial"/>
@@ -8479,7 +8328,34 @@
           <w:sz w:val="24"/>
           <w:szCs w:val="24"/>
         </w:rPr>
-        <w:t xml:space="preserve">fissional etc. </w:t>
+        <w:t xml:space="preserve"> e a automação com Cypress. Essa experiência me mostro, na prática, como um planejamento </w:t>
+      </w:r>
+      <w:r>
+        <w:rPr>
+          <w:rFonts w:ascii="Arial" w:eastAsia="Arial" w:hAnsi="Arial" w:cs="Arial"/>
+          <w:color w:val="000000" w:themeColor="text1"/>
+          <w:sz w:val="24"/>
+          <w:szCs w:val="24"/>
+        </w:rPr>
+        <w:t>bem-feito</w:t>
+      </w:r>
+      <w:r>
+        <w:rPr>
+          <w:rFonts w:ascii="Arial" w:eastAsia="Arial" w:hAnsi="Arial" w:cs="Arial"/>
+          <w:color w:val="000000" w:themeColor="text1"/>
+          <w:sz w:val="24"/>
+          <w:szCs w:val="24"/>
+        </w:rPr>
+        <w:t xml:space="preserve"> impacta diretamente a </w:t>
+      </w:r>
+      <w:r>
+        <w:rPr>
+          <w:rFonts w:ascii="Arial" w:eastAsia="Arial" w:hAnsi="Arial" w:cs="Arial"/>
+          <w:color w:val="000000" w:themeColor="text1"/>
+          <w:sz w:val="24"/>
+          <w:szCs w:val="24"/>
+        </w:rPr>
+        <w:t>qualidade das entregas e eficiência das validações.</w:t>
       </w:r>
     </w:p>
     <w:p>
@@ -8488,24 +8364,83 @@
         <w:jc w:val="both"/>
         <w:rPr>
           <w:rFonts w:ascii="Arial" w:eastAsia="Arial" w:hAnsi="Arial" w:cs="Arial"/>
-          <w:b/>
-          <w:color w:val="000000" w:themeColor="text1"/>
-          <w:sz w:val="24"/>
-          <w:szCs w:val="24"/>
-        </w:rPr>
-      </w:pPr>
-    </w:p>
-    <w:p>
-      <w:pPr>
-        <w:pStyle w:val="Ttulo1"/>
-      </w:pPr>
-      <w:bookmarkStart w:id="18" w:name="_Toc85541187"/>
-      <w:r>
-        <w:t>REFERÊNCIAS BIBLIOGRÁFICAS</w:t>
-      </w:r>
-      <w:bookmarkEnd w:id="18"/>
-      <w:r>
-        <w:t xml:space="preserve"> </w:t>
+          <w:color w:val="000000" w:themeColor="text1"/>
+          <w:sz w:val="24"/>
+          <w:szCs w:val="24"/>
+        </w:rPr>
+      </w:pPr>
+      <w:r>
+        <w:rPr>
+          <w:rFonts w:ascii="Arial" w:eastAsia="Arial" w:hAnsi="Arial" w:cs="Arial"/>
+          <w:color w:val="000000" w:themeColor="text1"/>
+          <w:sz w:val="24"/>
+          <w:szCs w:val="24"/>
+        </w:rPr>
+        <w:tab/>
+        <w:t xml:space="preserve">A realização do projeto também me permitiu aplicar as práticas de QA de forma integrada, conectando planejamento, automação e monitoramento de resultados. A automação com Cypress aumentou a repetibilidade dos testes e reduziu o tempo de regressão, tornando o processo mais confiável e produtivo. </w:t>
+      </w:r>
+    </w:p>
+    <w:p>
+      <w:pPr>
+        <w:spacing w:line="360" w:lineRule="auto"/>
+        <w:ind w:firstLine="360"/>
+        <w:jc w:val="both"/>
+        <w:rPr>
+          <w:rFonts w:ascii="Arial" w:eastAsia="Arial" w:hAnsi="Arial" w:cs="Arial"/>
+          <w:color w:val="000000" w:themeColor="text1"/>
+          <w:sz w:val="24"/>
+          <w:szCs w:val="24"/>
+        </w:rPr>
+      </w:pPr>
+      <w:r>
+        <w:rPr>
+          <w:rFonts w:ascii="Arial" w:eastAsia="Arial" w:hAnsi="Arial" w:cs="Arial"/>
+          <w:color w:val="000000" w:themeColor="text1"/>
+          <w:sz w:val="24"/>
+          <w:szCs w:val="24"/>
+        </w:rPr>
+        <w:t>Além disso, o contato com testes de API e performance ampliou minha visão sobre qualidade, reforçando a importância de evidências objetivas para apoiar análises técnicas e tomadas de decisão.</w:t>
+      </w:r>
+    </w:p>
+    <w:p>
+      <w:pPr>
+        <w:spacing w:line="360" w:lineRule="auto"/>
+        <w:ind w:firstLine="360"/>
+        <w:jc w:val="both"/>
+        <w:rPr>
+          <w:rFonts w:ascii="Arial" w:eastAsia="Arial" w:hAnsi="Arial" w:cs="Arial"/>
+          <w:color w:val="000000" w:themeColor="text1"/>
+          <w:sz w:val="24"/>
+          <w:szCs w:val="24"/>
+        </w:rPr>
+      </w:pPr>
+      <w:r>
+        <w:rPr>
+          <w:rFonts w:ascii="Arial" w:eastAsia="Arial" w:hAnsi="Arial" w:cs="Arial"/>
+          <w:color w:val="000000" w:themeColor="text1"/>
+          <w:sz w:val="24"/>
+          <w:szCs w:val="24"/>
+        </w:rPr>
+        <w:lastRenderedPageBreak/>
+        <w:t xml:space="preserve">Como lições para minha vida profissional, levo a importância de estruturar testes com clareza, priorizar cobertura funcional e não funcional desde o </w:t>
+      </w:r>
+      <w:r>
+        <w:rPr>
+          <w:rFonts w:ascii="Arial" w:eastAsia="Arial" w:hAnsi="Arial" w:cs="Arial"/>
+          <w:color w:val="000000" w:themeColor="text1"/>
+          <w:sz w:val="24"/>
+          <w:szCs w:val="24"/>
+        </w:rPr>
+        <w:t>início</w:t>
+      </w:r>
+      <w:r>
+        <w:rPr>
+          <w:rFonts w:ascii="Arial" w:eastAsia="Arial" w:hAnsi="Arial" w:cs="Arial"/>
+          <w:color w:val="000000" w:themeColor="text1"/>
+          <w:sz w:val="24"/>
+          <w:szCs w:val="24"/>
+        </w:rPr>
+        <w:t xml:space="preserve"> e manter rastreabilidade dos resultados. </w:t>
       </w:r>
     </w:p>
     <w:p>
@@ -8514,6 +8449,7 @@
         <w:jc w:val="both"/>
         <w:rPr>
           <w:rFonts w:ascii="Arial" w:eastAsia="Arial" w:hAnsi="Arial" w:cs="Arial"/>
+          <w:b/>
           <w:color w:val="000000" w:themeColor="text1"/>
           <w:sz w:val="24"/>
           <w:szCs w:val="24"/>
@@ -8525,20 +8461,580 @@
           <w:color w:val="000000" w:themeColor="text1"/>
           <w:sz w:val="24"/>
           <w:szCs w:val="24"/>
-          <w:highlight w:val="yellow"/>
-        </w:rPr>
-        <w:t>Seguir regras ABNT</w:t>
-      </w:r>
-      <w:r>
-        <w:rPr>
-          <w:rFonts w:ascii="Arial" w:eastAsia="Arial" w:hAnsi="Arial" w:cs="Arial"/>
-          <w:color w:val="000000" w:themeColor="text1"/>
-          <w:sz w:val="24"/>
-          <w:szCs w:val="24"/>
-        </w:rPr>
+        </w:rPr>
+        <w:tab/>
+      </w:r>
+    </w:p>
+    <w:p>
+      <w:pPr>
+        <w:pStyle w:val="Ttulo1"/>
+      </w:pPr>
+      <w:bookmarkStart w:id="18" w:name="_Toc85541187"/>
+      <w:r>
+        <w:t>REFERÊNCIAS BIBLIOGRÁFICAS</w:t>
+      </w:r>
+      <w:bookmarkEnd w:id="18"/>
+      <w:r>
         <w:t xml:space="preserve"> </w:t>
       </w:r>
     </w:p>
+    <w:p/>
+    <w:p>
+      <w:pPr>
+        <w:rPr>
+          <w:rFonts w:asciiTheme="minorBidi" w:hAnsiTheme="minorBidi"/>
+          <w:sz w:val="24"/>
+          <w:szCs w:val="24"/>
+        </w:rPr>
+      </w:pPr>
+      <w:r>
+        <w:rPr>
+          <w:rFonts w:asciiTheme="minorBidi" w:hAnsiTheme="minorBidi"/>
+          <w:sz w:val="24"/>
+          <w:szCs w:val="24"/>
+          <w:lang w:val="en-US"/>
+        </w:rPr>
+        <w:t xml:space="preserve">APACHE JMETER PROJECT. Apache JMeter User Manual. </w:t>
+      </w:r>
+      <w:r>
+        <w:rPr>
+          <w:rFonts w:asciiTheme="minorBidi" w:hAnsiTheme="minorBidi"/>
+          <w:sz w:val="24"/>
+          <w:szCs w:val="24"/>
+        </w:rPr>
+        <w:t>Disponível em: https://jmeter.apache.org/usermanual/index.html.</w:t>
+      </w:r>
+    </w:p>
+    <w:p>
+      <w:pPr>
+        <w:rPr>
+          <w:rFonts w:asciiTheme="minorBidi" w:hAnsiTheme="minorBidi"/>
+          <w:sz w:val="24"/>
+          <w:szCs w:val="24"/>
+        </w:rPr>
+      </w:pPr>
+    </w:p>
+    <w:p>
+      <w:pPr>
+        <w:rPr>
+          <w:rFonts w:asciiTheme="minorBidi" w:hAnsiTheme="minorBidi"/>
+          <w:sz w:val="24"/>
+          <w:szCs w:val="24"/>
+        </w:rPr>
+      </w:pPr>
+      <w:r>
+        <w:rPr>
+          <w:rFonts w:asciiTheme="minorBidi" w:hAnsiTheme="minorBidi"/>
+          <w:sz w:val="24"/>
+          <w:szCs w:val="24"/>
+        </w:rPr>
+        <w:t xml:space="preserve">CYPRESS. Cypress </w:t>
+      </w:r>
+      <w:proofErr w:type="spellStart"/>
+      <w:r>
+        <w:rPr>
+          <w:rFonts w:asciiTheme="minorBidi" w:hAnsiTheme="minorBidi"/>
+          <w:sz w:val="24"/>
+          <w:szCs w:val="24"/>
+        </w:rPr>
+        <w:t>Documentation</w:t>
+      </w:r>
+      <w:proofErr w:type="spellEnd"/>
+      <w:r>
+        <w:rPr>
+          <w:rFonts w:asciiTheme="minorBidi" w:hAnsiTheme="minorBidi"/>
+          <w:sz w:val="24"/>
+          <w:szCs w:val="24"/>
+        </w:rPr>
+        <w:t>. Disponível em: https://docs.cypress.io/.</w:t>
+      </w:r>
+    </w:p>
+    <w:p>
+      <w:pPr>
+        <w:rPr>
+          <w:rFonts w:asciiTheme="minorBidi" w:hAnsiTheme="minorBidi"/>
+          <w:sz w:val="24"/>
+          <w:szCs w:val="24"/>
+        </w:rPr>
+      </w:pPr>
+    </w:p>
+    <w:p>
+      <w:pPr>
+        <w:rPr>
+          <w:rFonts w:asciiTheme="minorBidi" w:hAnsiTheme="minorBidi"/>
+          <w:sz w:val="24"/>
+          <w:szCs w:val="24"/>
+        </w:rPr>
+      </w:pPr>
+      <w:r>
+        <w:rPr>
+          <w:rFonts w:asciiTheme="minorBidi" w:hAnsiTheme="minorBidi"/>
+          <w:sz w:val="24"/>
+          <w:szCs w:val="24"/>
+        </w:rPr>
+        <w:t xml:space="preserve">FIELDING, R.; RESCHKE, J. RFC 7231: Hypertext </w:t>
+      </w:r>
+      <w:proofErr w:type="spellStart"/>
+      <w:r>
+        <w:rPr>
+          <w:rFonts w:asciiTheme="minorBidi" w:hAnsiTheme="minorBidi"/>
+          <w:sz w:val="24"/>
+          <w:szCs w:val="24"/>
+        </w:rPr>
+        <w:t>Transfer</w:t>
+      </w:r>
+      <w:proofErr w:type="spellEnd"/>
+      <w:r>
+        <w:rPr>
+          <w:rFonts w:asciiTheme="minorBidi" w:hAnsiTheme="minorBidi"/>
+          <w:sz w:val="24"/>
+          <w:szCs w:val="24"/>
+        </w:rPr>
+        <w:t xml:space="preserve"> </w:t>
+      </w:r>
+      <w:proofErr w:type="spellStart"/>
+      <w:r>
+        <w:rPr>
+          <w:rFonts w:asciiTheme="minorBidi" w:hAnsiTheme="minorBidi"/>
+          <w:sz w:val="24"/>
+          <w:szCs w:val="24"/>
+        </w:rPr>
+        <w:t>Protocol</w:t>
+      </w:r>
+      <w:proofErr w:type="spellEnd"/>
+      <w:r>
+        <w:rPr>
+          <w:rFonts w:asciiTheme="minorBidi" w:hAnsiTheme="minorBidi"/>
+          <w:sz w:val="24"/>
+          <w:szCs w:val="24"/>
+        </w:rPr>
+        <w:t xml:space="preserve"> (HTTP/1.1): </w:t>
+      </w:r>
+      <w:proofErr w:type="spellStart"/>
+      <w:r>
+        <w:rPr>
+          <w:rFonts w:asciiTheme="minorBidi" w:hAnsiTheme="minorBidi"/>
+          <w:sz w:val="24"/>
+          <w:szCs w:val="24"/>
+        </w:rPr>
+        <w:t>Semantics</w:t>
+      </w:r>
+      <w:proofErr w:type="spellEnd"/>
+      <w:r>
+        <w:rPr>
+          <w:rFonts w:asciiTheme="minorBidi" w:hAnsiTheme="minorBidi"/>
+          <w:sz w:val="24"/>
+          <w:szCs w:val="24"/>
+        </w:rPr>
+        <w:t xml:space="preserve"> </w:t>
+      </w:r>
+      <w:proofErr w:type="spellStart"/>
+      <w:r>
+        <w:rPr>
+          <w:rFonts w:asciiTheme="minorBidi" w:hAnsiTheme="minorBidi"/>
+          <w:sz w:val="24"/>
+          <w:szCs w:val="24"/>
+        </w:rPr>
+        <w:t>and</w:t>
+      </w:r>
+      <w:proofErr w:type="spellEnd"/>
+      <w:r>
+        <w:rPr>
+          <w:rFonts w:asciiTheme="minorBidi" w:hAnsiTheme="minorBidi"/>
+          <w:sz w:val="24"/>
+          <w:szCs w:val="24"/>
+        </w:rPr>
+        <w:t xml:space="preserve"> </w:t>
+      </w:r>
+      <w:proofErr w:type="spellStart"/>
+      <w:r>
+        <w:rPr>
+          <w:rFonts w:asciiTheme="minorBidi" w:hAnsiTheme="minorBidi"/>
+          <w:sz w:val="24"/>
+          <w:szCs w:val="24"/>
+        </w:rPr>
+        <w:t>Content</w:t>
+      </w:r>
+      <w:proofErr w:type="spellEnd"/>
+      <w:r>
+        <w:rPr>
+          <w:rFonts w:asciiTheme="minorBidi" w:hAnsiTheme="minorBidi"/>
+          <w:sz w:val="24"/>
+          <w:szCs w:val="24"/>
+        </w:rPr>
+        <w:t xml:space="preserve">. IETF, 2014. Disponível em: https://www.rfc-editor.org/rfc/rfc7231. </w:t>
+      </w:r>
+    </w:p>
+    <w:p>
+      <w:pPr>
+        <w:rPr>
+          <w:rFonts w:asciiTheme="minorBidi" w:hAnsiTheme="minorBidi"/>
+          <w:sz w:val="24"/>
+          <w:szCs w:val="24"/>
+        </w:rPr>
+      </w:pPr>
+    </w:p>
+    <w:p>
+      <w:pPr>
+        <w:rPr>
+          <w:rFonts w:asciiTheme="minorBidi" w:hAnsiTheme="minorBidi"/>
+          <w:sz w:val="24"/>
+          <w:szCs w:val="24"/>
+          <w:lang w:val="en-US"/>
+        </w:rPr>
+      </w:pPr>
+      <w:r>
+        <w:rPr>
+          <w:rFonts w:asciiTheme="minorBidi" w:hAnsiTheme="minorBidi"/>
+          <w:sz w:val="24"/>
+          <w:szCs w:val="24"/>
+        </w:rPr>
+        <w:t xml:space="preserve">GITHUB. GitHub Docs. Disponível em: https://docs.github.com/. </w:t>
+      </w:r>
+    </w:p>
+    <w:p>
+      <w:pPr>
+        <w:rPr>
+          <w:rFonts w:asciiTheme="minorBidi" w:hAnsiTheme="minorBidi"/>
+          <w:sz w:val="24"/>
+          <w:szCs w:val="24"/>
+          <w:lang w:val="en-US"/>
+        </w:rPr>
+      </w:pPr>
+    </w:p>
+    <w:p>
+      <w:pPr>
+        <w:rPr>
+          <w:rFonts w:asciiTheme="minorBidi" w:hAnsiTheme="minorBidi"/>
+          <w:sz w:val="24"/>
+          <w:szCs w:val="24"/>
+          <w:lang w:val="en-US"/>
+        </w:rPr>
+      </w:pPr>
+      <w:r>
+        <w:rPr>
+          <w:rFonts w:asciiTheme="minorBidi" w:hAnsiTheme="minorBidi"/>
+          <w:sz w:val="24"/>
+          <w:szCs w:val="24"/>
+          <w:lang w:val="en-US"/>
+        </w:rPr>
+        <w:t>INTERNATIONAL ORGANIZATION FOR STANDARDIZATION. ISO/IEC 25010:2011 - Systems and software engineering - Systems and software Quality Requirements and Evaluation (</w:t>
+      </w:r>
+      <w:proofErr w:type="spellStart"/>
+      <w:r>
+        <w:rPr>
+          <w:rFonts w:asciiTheme="minorBidi" w:hAnsiTheme="minorBidi"/>
+          <w:sz w:val="24"/>
+          <w:szCs w:val="24"/>
+          <w:lang w:val="en-US"/>
+        </w:rPr>
+        <w:t>SQuaRE</w:t>
+      </w:r>
+      <w:proofErr w:type="spellEnd"/>
+      <w:r>
+        <w:rPr>
+          <w:rFonts w:asciiTheme="minorBidi" w:hAnsiTheme="minorBidi"/>
+          <w:sz w:val="24"/>
+          <w:szCs w:val="24"/>
+          <w:lang w:val="en-US"/>
+        </w:rPr>
+        <w:t>) - System and software quality models. Geneva: ISO, 2011.</w:t>
+      </w:r>
+    </w:p>
+    <w:p>
+      <w:pPr>
+        <w:rPr>
+          <w:rFonts w:asciiTheme="minorBidi" w:hAnsiTheme="minorBidi"/>
+          <w:sz w:val="24"/>
+          <w:szCs w:val="24"/>
+          <w:lang w:val="en-US"/>
+        </w:rPr>
+      </w:pPr>
+    </w:p>
+    <w:p>
+      <w:pPr>
+        <w:rPr>
+          <w:rFonts w:asciiTheme="minorBidi" w:hAnsiTheme="minorBidi"/>
+          <w:sz w:val="24"/>
+          <w:szCs w:val="24"/>
+        </w:rPr>
+      </w:pPr>
+      <w:r>
+        <w:rPr>
+          <w:rFonts w:asciiTheme="minorBidi" w:hAnsiTheme="minorBidi"/>
+          <w:sz w:val="24"/>
+          <w:szCs w:val="24"/>
+          <w:lang w:val="en-US"/>
+        </w:rPr>
+        <w:t xml:space="preserve">ISTQB. Certified Tester Foundation Level (CTFL) Syllabus v4.0. </w:t>
+      </w:r>
+      <w:r>
+        <w:rPr>
+          <w:rFonts w:asciiTheme="minorBidi" w:hAnsiTheme="minorBidi"/>
+          <w:sz w:val="24"/>
+          <w:szCs w:val="24"/>
+        </w:rPr>
+        <w:t>Disponível em: https://www.istqb.org/certifications/certified-tester-foundation-level.</w:t>
+      </w:r>
+    </w:p>
+    <w:p>
+      <w:pPr>
+        <w:rPr>
+          <w:rFonts w:asciiTheme="minorBidi" w:hAnsiTheme="minorBidi"/>
+          <w:sz w:val="24"/>
+          <w:szCs w:val="24"/>
+        </w:rPr>
+      </w:pPr>
+    </w:p>
+    <w:p>
+      <w:pPr>
+        <w:rPr>
+          <w:rFonts w:asciiTheme="minorBidi" w:hAnsiTheme="minorBidi"/>
+          <w:sz w:val="24"/>
+          <w:szCs w:val="24"/>
+        </w:rPr>
+      </w:pPr>
+      <w:r>
+        <w:rPr>
+          <w:rFonts w:asciiTheme="minorBidi" w:hAnsiTheme="minorBidi"/>
+          <w:sz w:val="24"/>
+          <w:szCs w:val="24"/>
+        </w:rPr>
+        <w:t xml:space="preserve">JENKINS. Jenkins </w:t>
+      </w:r>
+      <w:proofErr w:type="spellStart"/>
+      <w:r>
+        <w:rPr>
+          <w:rFonts w:asciiTheme="minorBidi" w:hAnsiTheme="minorBidi"/>
+          <w:sz w:val="24"/>
+          <w:szCs w:val="24"/>
+        </w:rPr>
+        <w:t>User</w:t>
+      </w:r>
+      <w:proofErr w:type="spellEnd"/>
+      <w:r>
+        <w:rPr>
+          <w:rFonts w:asciiTheme="minorBidi" w:hAnsiTheme="minorBidi"/>
+          <w:sz w:val="24"/>
+          <w:szCs w:val="24"/>
+        </w:rPr>
+        <w:t xml:space="preserve"> </w:t>
+      </w:r>
+      <w:proofErr w:type="spellStart"/>
+      <w:r>
+        <w:rPr>
+          <w:rFonts w:asciiTheme="minorBidi" w:hAnsiTheme="minorBidi"/>
+          <w:sz w:val="24"/>
+          <w:szCs w:val="24"/>
+        </w:rPr>
+        <w:t>Documentation</w:t>
+      </w:r>
+      <w:proofErr w:type="spellEnd"/>
+      <w:r>
+        <w:rPr>
+          <w:rFonts w:asciiTheme="minorBidi" w:hAnsiTheme="minorBidi"/>
+          <w:sz w:val="24"/>
+          <w:szCs w:val="24"/>
+        </w:rPr>
+        <w:t xml:space="preserve">. Disponível em: https://www.jenkins.io/doc/. </w:t>
+      </w:r>
+    </w:p>
+    <w:p>
+      <w:pPr>
+        <w:rPr>
+          <w:rFonts w:asciiTheme="minorBidi" w:hAnsiTheme="minorBidi"/>
+          <w:sz w:val="24"/>
+          <w:szCs w:val="24"/>
+        </w:rPr>
+      </w:pPr>
+    </w:p>
+    <w:p>
+      <w:pPr>
+        <w:rPr>
+          <w:rFonts w:asciiTheme="minorBidi" w:hAnsiTheme="minorBidi"/>
+          <w:sz w:val="24"/>
+          <w:szCs w:val="24"/>
+          <w:lang w:val="en-US"/>
+        </w:rPr>
+      </w:pPr>
+      <w:r>
+        <w:rPr>
+          <w:rFonts w:asciiTheme="minorBidi" w:hAnsiTheme="minorBidi"/>
+          <w:sz w:val="24"/>
+          <w:szCs w:val="24"/>
+        </w:rPr>
+        <w:t xml:space="preserve">MOCHAWESOME. </w:t>
+      </w:r>
+      <w:proofErr w:type="spellStart"/>
+      <w:r>
+        <w:rPr>
+          <w:rFonts w:asciiTheme="minorBidi" w:hAnsiTheme="minorBidi"/>
+          <w:sz w:val="24"/>
+          <w:szCs w:val="24"/>
+        </w:rPr>
+        <w:t>Mochawesome</w:t>
+      </w:r>
+      <w:proofErr w:type="spellEnd"/>
+      <w:r>
+        <w:rPr>
+          <w:rFonts w:asciiTheme="minorBidi" w:hAnsiTheme="minorBidi"/>
+          <w:sz w:val="24"/>
+          <w:szCs w:val="24"/>
+        </w:rPr>
+        <w:t xml:space="preserve"> Reporter </w:t>
+      </w:r>
+      <w:proofErr w:type="spellStart"/>
+      <w:r>
+        <w:rPr>
+          <w:rFonts w:asciiTheme="minorBidi" w:hAnsiTheme="minorBidi"/>
+          <w:sz w:val="24"/>
+          <w:szCs w:val="24"/>
+        </w:rPr>
+        <w:t>Documentation</w:t>
+      </w:r>
+      <w:proofErr w:type="spellEnd"/>
+      <w:r>
+        <w:rPr>
+          <w:rFonts w:asciiTheme="minorBidi" w:hAnsiTheme="minorBidi"/>
+          <w:sz w:val="24"/>
+          <w:szCs w:val="24"/>
+        </w:rPr>
+        <w:t xml:space="preserve">. Disponível em: https://github.com/adamgruber/mochawesome. </w:t>
+      </w:r>
+    </w:p>
+    <w:p>
+      <w:pPr>
+        <w:rPr>
+          <w:rFonts w:asciiTheme="minorBidi" w:hAnsiTheme="minorBidi"/>
+          <w:sz w:val="24"/>
+          <w:szCs w:val="24"/>
+          <w:lang w:val="en-US"/>
+        </w:rPr>
+      </w:pPr>
+    </w:p>
+    <w:p>
+      <w:pPr>
+        <w:rPr>
+          <w:rFonts w:asciiTheme="minorBidi" w:hAnsiTheme="minorBidi"/>
+          <w:sz w:val="24"/>
+          <w:szCs w:val="24"/>
+        </w:rPr>
+      </w:pPr>
+      <w:r>
+        <w:rPr>
+          <w:rFonts w:asciiTheme="minorBidi" w:hAnsiTheme="minorBidi"/>
+          <w:sz w:val="24"/>
+          <w:szCs w:val="24"/>
+          <w:lang w:val="en-US"/>
+        </w:rPr>
+        <w:t xml:space="preserve">OWASP FOUNDATION. OWASP Web Security Testing Guide. </w:t>
+      </w:r>
+      <w:r>
+        <w:rPr>
+          <w:rFonts w:asciiTheme="minorBidi" w:hAnsiTheme="minorBidi"/>
+          <w:sz w:val="24"/>
+          <w:szCs w:val="24"/>
+        </w:rPr>
+        <w:t>Disponível em: https://owasp.org/www-project-web-security-testing-guide/.</w:t>
+      </w:r>
+    </w:p>
+    <w:p>
+      <w:pPr>
+        <w:rPr>
+          <w:rFonts w:asciiTheme="minorBidi" w:hAnsiTheme="minorBidi"/>
+          <w:sz w:val="24"/>
+          <w:szCs w:val="24"/>
+        </w:rPr>
+      </w:pPr>
+    </w:p>
+    <w:p>
+      <w:pPr>
+        <w:rPr>
+          <w:rFonts w:asciiTheme="minorBidi" w:hAnsiTheme="minorBidi"/>
+          <w:sz w:val="24"/>
+          <w:szCs w:val="24"/>
+        </w:rPr>
+      </w:pPr>
+      <w:r>
+        <w:rPr>
+          <w:rFonts w:asciiTheme="minorBidi" w:hAnsiTheme="minorBidi"/>
+          <w:sz w:val="24"/>
+          <w:szCs w:val="24"/>
+        </w:rPr>
+        <w:t xml:space="preserve">POSTMAN. </w:t>
+      </w:r>
+      <w:proofErr w:type="spellStart"/>
+      <w:r>
+        <w:rPr>
+          <w:rFonts w:asciiTheme="minorBidi" w:hAnsiTheme="minorBidi"/>
+          <w:sz w:val="24"/>
+          <w:szCs w:val="24"/>
+        </w:rPr>
+        <w:t>Postman</w:t>
+      </w:r>
+      <w:proofErr w:type="spellEnd"/>
+      <w:r>
+        <w:rPr>
+          <w:rFonts w:asciiTheme="minorBidi" w:hAnsiTheme="minorBidi"/>
+          <w:sz w:val="24"/>
+          <w:szCs w:val="24"/>
+        </w:rPr>
+        <w:t xml:space="preserve"> Learning Center. Disponível em: https://learning.postman.com/. A</w:t>
+      </w:r>
+    </w:p>
+    <w:p>
+      <w:pPr>
+        <w:rPr>
+          <w:rFonts w:asciiTheme="minorBidi" w:hAnsiTheme="minorBidi"/>
+          <w:sz w:val="24"/>
+          <w:szCs w:val="24"/>
+        </w:rPr>
+      </w:pPr>
+    </w:p>
+    <w:p>
+      <w:pPr>
+        <w:rPr>
+          <w:rFonts w:asciiTheme="minorBidi" w:hAnsiTheme="minorBidi"/>
+          <w:sz w:val="24"/>
+          <w:szCs w:val="24"/>
+        </w:rPr>
+      </w:pPr>
+      <w:r>
+        <w:rPr>
+          <w:rFonts w:asciiTheme="minorBidi" w:hAnsiTheme="minorBidi"/>
+          <w:sz w:val="24"/>
+          <w:szCs w:val="24"/>
+        </w:rPr>
+        <w:t>PRESSMAN, R. S.; MAXIM, B. R. Engenharia de Software: uma abordagem profissional. 8. ed. Porto Alegre: AMGH, 2016.</w:t>
+      </w:r>
+    </w:p>
+    <w:p>
+      <w:pPr>
+        <w:rPr>
+          <w:rFonts w:asciiTheme="minorBidi" w:hAnsiTheme="minorBidi"/>
+          <w:sz w:val="24"/>
+          <w:szCs w:val="24"/>
+        </w:rPr>
+      </w:pPr>
+    </w:p>
+    <w:p>
+      <w:pPr>
+        <w:rPr>
+          <w:rFonts w:asciiTheme="minorBidi" w:hAnsiTheme="minorBidi"/>
+          <w:sz w:val="24"/>
+          <w:szCs w:val="24"/>
+        </w:rPr>
+      </w:pPr>
+      <w:r>
+        <w:rPr>
+          <w:rFonts w:asciiTheme="minorBidi" w:hAnsiTheme="minorBidi"/>
+          <w:sz w:val="24"/>
+          <w:szCs w:val="24"/>
+        </w:rPr>
+        <w:t>SOMMERVILLE, I. Engenharia de Software. 10. ed. São Paulo: Pearson, 2019.</w:t>
+      </w:r>
+    </w:p>
+    <w:p/>
     <w:sectPr>
       <w:pgSz w:w="11906" w:h="16838"/>
       <w:pgMar w:top="1417" w:right="1701" w:bottom="1417" w:left="1701" w:header="708" w:footer="708" w:gutter="0"/>
@@ -8552,6 +9048,87 @@
 <file path=word/numbering.xml><?xml version="1.0" encoding="utf-8"?>
 <w:numbering xmlns:wpc="http://schemas.microsoft.com/office/word/2010/wordprocessingCanvas" xmlns:cx="http://schemas.microsoft.com/office/drawing/2014/chartex" xmlns:cx1="http://schemas.microsoft.com/office/drawing/2015/9/8/chartex" xmlns:cx2="http://schemas.microsoft.com/office/drawing/2015/10/21/chartex" xmlns:cx3="http://schemas.microsoft.com/office/drawing/2016/5/9/chartex" xmlns:cx4="http://schemas.microsoft.com/office/drawing/2016/5/10/chartex" xmlns:cx5="http://schemas.microsoft.com/office/drawing/2016/5/11/chartex" xmlns:cx6="http://schemas.microsoft.com/office/drawing/2016/5/12/chartex" xmlns:cx7="http://schemas.microsoft.com/office/drawing/2016/5/13/chartex" xmlns:cx8="http://schemas.microsoft.com/office/drawing/2016/5/14/chartex" xmlns:mc="http://schemas.openxmlformats.org/markup-compatibility/2006" xmlns:aink="http://schemas.microsoft.com/office/drawing/2016/ink" xmlns:am3d="http://schemas.microsoft.com/office/drawing/2017/model3d" xmlns:o="urn:schemas-microsoft-com:office:office" xmlns:oel="http://schemas.microsoft.com/office/2019/extlst" xmlns:r="http://schemas.openxmlformats.org/officeDocument/2006/relationships" xmlns:m="http://schemas.openxmlformats.org/officeDocument/2006/math" xmlns:v="urn:schemas-microsoft-com:vml" xmlns:wp14="http://schemas.microsoft.com/office/word/2010/wordprocessingDrawing" xmlns:wp="http://schemas.openxmlformats.org/drawingml/2006/wordprocessingDrawing" xmlns:w10="urn:schemas-microsoft-com:office:word" xmlns:w="http://schemas.openxmlformats.org/wordprocessingml/2006/main" xmlns:w14="http://schemas.microsoft.com/office/word/2010/wordml" xmlns:w15="http://schemas.microsoft.com/office/word/2012/wordml" xmlns:w16cex="http://schemas.microsoft.com/office/word/2018/wordml/cex" xmlns:w16cid="http://schemas.microsoft.com/office/word/2016/wordml/cid" xmlns:w16="http://schemas.microsoft.com/office/word/2018/wordml" xmlns:w16du="http://schemas.microsoft.com/office/word/2023/wordml/word16du" xmlns:w16sdtdh="http://schemas.microsoft.com/office/word/2020/wordml/sdtdatahash" xmlns:w16sdtfl="http://schemas.microsoft.com/office/word/2024/wordml/sdtformatlock" xmlns:w16se="http://schemas.microsoft.com/office/word/2015/wordml/symex" xmlns:wpg="http://schemas.microsoft.com/office/word/2010/wordprocessingGroup" xmlns:wpi="http://schemas.microsoft.com/office/word/2010/wordprocessingInk" xmlns:wne="http://schemas.microsoft.com/office/word/2006/wordml" xmlns:wps="http://schemas.microsoft.com/office/word/2010/wordprocessingShape" mc:Ignorable="w14 w15 w16se w16cid w16 w16cex w16sdtdh w16sdtfl w16du wp14">
   <w:abstractNum w:abstractNumId="0" w15:restartNumberingAfterBreak="0">
+    <w:nsid w:val="0000A991"/>
+    <w:multiLevelType w:val="multilevel"/>
+    <w:tmpl w:val="9D36CEB8"/>
+    <w:lvl w:ilvl="0">
+      <w:start w:val="1"/>
+      <w:numFmt w:val="bullet"/>
+      <w:lvlText w:val=""/>
+      <w:lvlJc w:val="left"/>
+      <w:pPr>
+        <w:ind w:left="480" w:hanging="480"/>
+      </w:pPr>
+      <w:rPr>
+        <w:rFonts w:ascii="Symbol" w:hAnsi="Symbol" w:hint="default"/>
+      </w:rPr>
+    </w:lvl>
+    <w:lvl w:ilvl="1">
+      <w:numFmt w:val="bullet"/>
+      <w:lvlText w:val="–"/>
+      <w:lvlJc w:val="left"/>
+      <w:pPr>
+        <w:ind w:left="1200" w:hanging="480"/>
+      </w:pPr>
+    </w:lvl>
+    <w:lvl w:ilvl="2">
+      <w:numFmt w:val="bullet"/>
+      <w:lvlText w:val="•"/>
+      <w:lvlJc w:val="left"/>
+      <w:pPr>
+        <w:ind w:left="1920" w:hanging="480"/>
+      </w:pPr>
+    </w:lvl>
+    <w:lvl w:ilvl="3">
+      <w:numFmt w:val="bullet"/>
+      <w:lvlText w:val="–"/>
+      <w:lvlJc w:val="left"/>
+      <w:pPr>
+        <w:ind w:left="2640" w:hanging="480"/>
+      </w:pPr>
+    </w:lvl>
+    <w:lvl w:ilvl="4">
+      <w:numFmt w:val="bullet"/>
+      <w:lvlText w:val="•"/>
+      <w:lvlJc w:val="left"/>
+      <w:pPr>
+        <w:ind w:left="3360" w:hanging="480"/>
+      </w:pPr>
+    </w:lvl>
+    <w:lvl w:ilvl="5">
+      <w:numFmt w:val="bullet"/>
+      <w:lvlText w:val="–"/>
+      <w:lvlJc w:val="left"/>
+      <w:pPr>
+        <w:ind w:left="4080" w:hanging="480"/>
+      </w:pPr>
+    </w:lvl>
+    <w:lvl w:ilvl="6">
+      <w:numFmt w:val="bullet"/>
+      <w:lvlText w:val="•"/>
+      <w:lvlJc w:val="left"/>
+      <w:pPr>
+        <w:ind w:left="4800" w:hanging="480"/>
+      </w:pPr>
+    </w:lvl>
+    <w:lvl w:ilvl="7">
+      <w:numFmt w:val="bullet"/>
+      <w:lvlText w:val="–"/>
+      <w:lvlJc w:val="left"/>
+      <w:pPr>
+        <w:ind w:left="5520" w:hanging="480"/>
+      </w:pPr>
+    </w:lvl>
+    <w:lvl w:ilvl="8">
+      <w:numFmt w:val="bullet"/>
+      <w:lvlText w:val="•"/>
+      <w:lvlJc w:val="left"/>
+      <w:pPr>
+        <w:ind w:left="6240" w:hanging="480"/>
+      </w:pPr>
+    </w:lvl>
+  </w:abstractNum>
+  <w:abstractNum w:abstractNumId="1" w15:restartNumberingAfterBreak="0">
     <w:nsid w:val="08A67F1B"/>
     <w:multiLevelType w:val="hybridMultilevel"/>
     <w:tmpl w:val="EB328086"/>
@@ -8664,7 +9241,7 @@
       </w:rPr>
     </w:lvl>
   </w:abstractNum>
-  <w:abstractNum w:abstractNumId="1" w15:restartNumberingAfterBreak="0">
+  <w:abstractNum w:abstractNumId="2" w15:restartNumberingAfterBreak="0">
     <w:nsid w:val="0D1E6CCD"/>
     <w:multiLevelType w:val="hybridMultilevel"/>
     <w:tmpl w:val="DCF2AF66"/>
@@ -8777,7 +9354,7 @@
       </w:rPr>
     </w:lvl>
   </w:abstractNum>
-  <w:abstractNum w:abstractNumId="2" w15:restartNumberingAfterBreak="0">
+  <w:abstractNum w:abstractNumId="3" w15:restartNumberingAfterBreak="0">
     <w:nsid w:val="1D74193A"/>
     <w:multiLevelType w:val="hybridMultilevel"/>
     <w:tmpl w:val="0BA867C6"/>
@@ -8890,7 +9467,7 @@
       </w:rPr>
     </w:lvl>
   </w:abstractNum>
-  <w:abstractNum w:abstractNumId="3" w15:restartNumberingAfterBreak="0">
+  <w:abstractNum w:abstractNumId="4" w15:restartNumberingAfterBreak="0">
     <w:nsid w:val="1E875101"/>
     <w:multiLevelType w:val="hybridMultilevel"/>
     <w:tmpl w:val="5A9CA03E"/>
@@ -8981,7 +9558,7 @@
       </w:pPr>
     </w:lvl>
   </w:abstractNum>
-  <w:abstractNum w:abstractNumId="4" w15:restartNumberingAfterBreak="0">
+  <w:abstractNum w:abstractNumId="5" w15:restartNumberingAfterBreak="0">
     <w:nsid w:val="268503A6"/>
     <w:multiLevelType w:val="hybridMultilevel"/>
     <w:tmpl w:val="28526002"/>
@@ -9094,7 +9671,7 @@
       </w:rPr>
     </w:lvl>
   </w:abstractNum>
-  <w:abstractNum w:abstractNumId="5" w15:restartNumberingAfterBreak="0">
+  <w:abstractNum w:abstractNumId="6" w15:restartNumberingAfterBreak="0">
     <w:nsid w:val="2B522B90"/>
     <w:multiLevelType w:val="hybridMultilevel"/>
     <w:tmpl w:val="AE90511E"/>
@@ -9183,7 +9760,7 @@
       </w:pPr>
     </w:lvl>
   </w:abstractNum>
-  <w:abstractNum w:abstractNumId="6" w15:restartNumberingAfterBreak="0">
+  <w:abstractNum w:abstractNumId="7" w15:restartNumberingAfterBreak="0">
     <w:nsid w:val="34084199"/>
     <w:multiLevelType w:val="hybridMultilevel"/>
     <w:tmpl w:val="8C227892"/>
@@ -9296,7 +9873,7 @@
       </w:rPr>
     </w:lvl>
   </w:abstractNum>
-  <w:abstractNum w:abstractNumId="7" w15:restartNumberingAfterBreak="0">
+  <w:abstractNum w:abstractNumId="8" w15:restartNumberingAfterBreak="0">
     <w:nsid w:val="34D57CCE"/>
     <w:multiLevelType w:val="hybridMultilevel"/>
     <w:tmpl w:val="AF84EE7E"/>
@@ -9387,7 +9964,7 @@
       </w:pPr>
     </w:lvl>
   </w:abstractNum>
-  <w:abstractNum w:abstractNumId="8" w15:restartNumberingAfterBreak="0">
+  <w:abstractNum w:abstractNumId="9" w15:restartNumberingAfterBreak="0">
     <w:nsid w:val="35430DDA"/>
     <w:multiLevelType w:val="hybridMultilevel"/>
     <w:tmpl w:val="B0509900"/>
@@ -9500,7 +10077,7 @@
       </w:rPr>
     </w:lvl>
   </w:abstractNum>
-  <w:abstractNum w:abstractNumId="9" w15:restartNumberingAfterBreak="0">
+  <w:abstractNum w:abstractNumId="10" w15:restartNumberingAfterBreak="0">
     <w:nsid w:val="365C368A"/>
     <w:multiLevelType w:val="multilevel"/>
     <w:tmpl w:val="D114A3EC"/>
@@ -9613,7 +10190,7 @@
       </w:rPr>
     </w:lvl>
   </w:abstractNum>
-  <w:abstractNum w:abstractNumId="10" w15:restartNumberingAfterBreak="0">
+  <w:abstractNum w:abstractNumId="11" w15:restartNumberingAfterBreak="0">
     <w:nsid w:val="37F61D44"/>
     <w:multiLevelType w:val="hybridMultilevel"/>
     <w:tmpl w:val="C2745C2E"/>
@@ -9726,7 +10303,7 @@
       </w:rPr>
     </w:lvl>
   </w:abstractNum>
-  <w:abstractNum w:abstractNumId="11" w15:restartNumberingAfterBreak="0">
+  <w:abstractNum w:abstractNumId="12" w15:restartNumberingAfterBreak="0">
     <w:nsid w:val="3E951AB0"/>
     <w:multiLevelType w:val="multilevel"/>
     <w:tmpl w:val="9E56C23E"/>
@@ -9846,7 +10423,7 @@
       </w:rPr>
     </w:lvl>
   </w:abstractNum>
-  <w:abstractNum w:abstractNumId="12" w15:restartNumberingAfterBreak="0">
+  <w:abstractNum w:abstractNumId="13" w15:restartNumberingAfterBreak="0">
     <w:nsid w:val="413262AD"/>
     <w:multiLevelType w:val="hybridMultilevel"/>
     <w:tmpl w:val="B1D606AC"/>
@@ -9959,7 +10536,7 @@
       </w:rPr>
     </w:lvl>
   </w:abstractNum>
-  <w:abstractNum w:abstractNumId="13" w15:restartNumberingAfterBreak="0">
+  <w:abstractNum w:abstractNumId="14" w15:restartNumberingAfterBreak="0">
     <w:nsid w:val="483E35F0"/>
     <w:multiLevelType w:val="hybridMultilevel"/>
     <w:tmpl w:val="55307BCA"/>
@@ -10072,7 +10649,7 @@
       </w:rPr>
     </w:lvl>
   </w:abstractNum>
-  <w:abstractNum w:abstractNumId="14" w15:restartNumberingAfterBreak="0">
+  <w:abstractNum w:abstractNumId="15" w15:restartNumberingAfterBreak="0">
     <w:nsid w:val="49DA7E76"/>
     <w:multiLevelType w:val="hybridMultilevel"/>
     <w:tmpl w:val="AF84EE7E"/>
@@ -10163,7 +10740,7 @@
       </w:pPr>
     </w:lvl>
   </w:abstractNum>
-  <w:abstractNum w:abstractNumId="15" w15:restartNumberingAfterBreak="0">
+  <w:abstractNum w:abstractNumId="16" w15:restartNumberingAfterBreak="0">
     <w:nsid w:val="586A1B27"/>
     <w:multiLevelType w:val="hybridMultilevel"/>
     <w:tmpl w:val="662E8682"/>
@@ -10276,7 +10853,7 @@
       </w:rPr>
     </w:lvl>
   </w:abstractNum>
-  <w:abstractNum w:abstractNumId="16" w15:restartNumberingAfterBreak="0">
+  <w:abstractNum w:abstractNumId="17" w15:restartNumberingAfterBreak="0">
     <w:nsid w:val="5C0B67E1"/>
     <w:multiLevelType w:val="multilevel"/>
     <w:tmpl w:val="D114A3EC"/>
@@ -10389,7 +10966,7 @@
       </w:rPr>
     </w:lvl>
   </w:abstractNum>
-  <w:abstractNum w:abstractNumId="17" w15:restartNumberingAfterBreak="0">
+  <w:abstractNum w:abstractNumId="18" w15:restartNumberingAfterBreak="0">
     <w:nsid w:val="607247B2"/>
     <w:multiLevelType w:val="hybridMultilevel"/>
     <w:tmpl w:val="6480E3DC"/>
@@ -10502,7 +11079,7 @@
       </w:rPr>
     </w:lvl>
   </w:abstractNum>
-  <w:abstractNum w:abstractNumId="18" w15:restartNumberingAfterBreak="0">
+  <w:abstractNum w:abstractNumId="19" w15:restartNumberingAfterBreak="0">
     <w:nsid w:val="60736EC4"/>
     <w:multiLevelType w:val="hybridMultilevel"/>
     <w:tmpl w:val="6816AE96"/>
@@ -10615,7 +11192,7 @@
       </w:rPr>
     </w:lvl>
   </w:abstractNum>
-  <w:abstractNum w:abstractNumId="19" w15:restartNumberingAfterBreak="0">
+  <w:abstractNum w:abstractNumId="20" w15:restartNumberingAfterBreak="0">
     <w:nsid w:val="60795E41"/>
     <w:multiLevelType w:val="hybridMultilevel"/>
     <w:tmpl w:val="A76A384C"/>
@@ -10728,7 +11305,7 @@
       </w:rPr>
     </w:lvl>
   </w:abstractNum>
-  <w:abstractNum w:abstractNumId="20" w15:restartNumberingAfterBreak="0">
+  <w:abstractNum w:abstractNumId="21" w15:restartNumberingAfterBreak="0">
     <w:nsid w:val="7E607BF0"/>
     <w:multiLevelType w:val="hybridMultilevel"/>
     <w:tmpl w:val="AF84EE7E"/>
@@ -10820,49 +11397,49 @@
     </w:lvl>
   </w:abstractNum>
   <w:num w:numId="1" w16cid:durableId="526673176">
+    <w:abstractNumId w:val="6"/>
+  </w:num>
+  <w:num w:numId="2" w16cid:durableId="1718579684">
+    <w:abstractNumId w:val="21"/>
+  </w:num>
+  <w:num w:numId="3" w16cid:durableId="1852210236">
+    <w:abstractNumId w:val="4"/>
+  </w:num>
+  <w:num w:numId="4" w16cid:durableId="335378562">
+    <w:abstractNumId w:val="8"/>
+  </w:num>
+  <w:num w:numId="5" w16cid:durableId="442581139">
+    <w:abstractNumId w:val="15"/>
+  </w:num>
+  <w:num w:numId="6" w16cid:durableId="1482499538">
+    <w:abstractNumId w:val="17"/>
+  </w:num>
+  <w:num w:numId="7" w16cid:durableId="3022198">
+    <w:abstractNumId w:val="4"/>
+  </w:num>
+  <w:num w:numId="8" w16cid:durableId="1440417897">
+    <w:abstractNumId w:val="10"/>
+  </w:num>
+  <w:num w:numId="9" w16cid:durableId="98910301">
+    <w:abstractNumId w:val="12"/>
+  </w:num>
+  <w:num w:numId="10" w16cid:durableId="395520212">
+    <w:abstractNumId w:val="13"/>
+  </w:num>
+  <w:num w:numId="11" w16cid:durableId="280191368">
+    <w:abstractNumId w:val="16"/>
+  </w:num>
+  <w:num w:numId="12" w16cid:durableId="2092769945">
     <w:abstractNumId w:val="5"/>
   </w:num>
-  <w:num w:numId="2" w16cid:durableId="1718579684">
-    <w:abstractNumId w:val="20"/>
-  </w:num>
-  <w:num w:numId="3" w16cid:durableId="1852210236">
-    <w:abstractNumId w:val="3"/>
-  </w:num>
-  <w:num w:numId="4" w16cid:durableId="335378562">
-    <w:abstractNumId w:val="7"/>
-  </w:num>
-  <w:num w:numId="5" w16cid:durableId="442581139">
-    <w:abstractNumId w:val="14"/>
-  </w:num>
-  <w:num w:numId="6" w16cid:durableId="1482499538">
-    <w:abstractNumId w:val="16"/>
-  </w:num>
-  <w:num w:numId="7" w16cid:durableId="3022198">
-    <w:abstractNumId w:val="3"/>
-  </w:num>
-  <w:num w:numId="8" w16cid:durableId="1440417897">
-    <w:abstractNumId w:val="9"/>
-  </w:num>
-  <w:num w:numId="9" w16cid:durableId="98910301">
-    <w:abstractNumId w:val="11"/>
-  </w:num>
-  <w:num w:numId="10" w16cid:durableId="395520212">
+  <w:num w:numId="13" w16cid:durableId="519665365">
     <w:abstractNumId w:val="12"/>
   </w:num>
-  <w:num w:numId="11" w16cid:durableId="280191368">
-    <w:abstractNumId w:val="15"/>
-  </w:num>
-  <w:num w:numId="12" w16cid:durableId="2092769945">
-    <w:abstractNumId w:val="4"/>
-  </w:num>
-  <w:num w:numId="13" w16cid:durableId="519665365">
-    <w:abstractNumId w:val="11"/>
-  </w:num>
   <w:num w:numId="14" w16cid:durableId="938489461">
-    <w:abstractNumId w:val="11"/>
+    <w:abstractNumId w:val="12"/>
   </w:num>
   <w:num w:numId="15" w16cid:durableId="2015180413">
-    <w:abstractNumId w:val="11"/>
+    <w:abstractNumId w:val="12"/>
     <w:lvlOverride w:ilvl="0">
       <w:startOverride w:val="1"/>
     </w:lvlOverride>
@@ -10892,7 +11469,7 @@
     </w:lvlOverride>
   </w:num>
   <w:num w:numId="16" w16cid:durableId="1722830269">
-    <w:abstractNumId w:val="11"/>
+    <w:abstractNumId w:val="12"/>
     <w:lvlOverride w:ilvl="0">
       <w:startOverride w:val="1"/>
     </w:lvlOverride>
@@ -10922,10 +11499,10 @@
     </w:lvlOverride>
   </w:num>
   <w:num w:numId="17" w16cid:durableId="1038776525">
-    <w:abstractNumId w:val="13"/>
+    <w:abstractNumId w:val="14"/>
   </w:num>
   <w:num w:numId="18" w16cid:durableId="1477839795">
-    <w:abstractNumId w:val="11"/>
+    <w:abstractNumId w:val="12"/>
     <w:lvlOverride w:ilvl="0">
       <w:startOverride w:val="1"/>
     </w:lvlOverride>
@@ -10955,30 +11532,33 @@
     </w:lvlOverride>
   </w:num>
   <w:num w:numId="19" w16cid:durableId="546528438">
+    <w:abstractNumId w:val="3"/>
+  </w:num>
+  <w:num w:numId="20" w16cid:durableId="1559702255">
+    <w:abstractNumId w:val="11"/>
+  </w:num>
+  <w:num w:numId="21" w16cid:durableId="2114738885">
+    <w:abstractNumId w:val="9"/>
+  </w:num>
+  <w:num w:numId="22" w16cid:durableId="10960041">
     <w:abstractNumId w:val="2"/>
   </w:num>
-  <w:num w:numId="20" w16cid:durableId="1559702255">
-    <w:abstractNumId w:val="10"/>
+  <w:num w:numId="23" w16cid:durableId="1872378853">
+    <w:abstractNumId w:val="7"/>
   </w:num>
-  <w:num w:numId="21" w16cid:durableId="2114738885">
-    <w:abstractNumId w:val="8"/>
+  <w:num w:numId="24" w16cid:durableId="1976984656">
+    <w:abstractNumId w:val="18"/>
   </w:num>
-  <w:num w:numId="22" w16cid:durableId="10960041">
+  <w:num w:numId="25" w16cid:durableId="943225170">
+    <w:abstractNumId w:val="19"/>
+  </w:num>
+  <w:num w:numId="26" w16cid:durableId="1837917902">
+    <w:abstractNumId w:val="20"/>
+  </w:num>
+  <w:num w:numId="27" w16cid:durableId="671033056">
     <w:abstractNumId w:val="1"/>
   </w:num>
-  <w:num w:numId="23" w16cid:durableId="1872378853">
-    <w:abstractNumId w:val="6"/>
-  </w:num>
-  <w:num w:numId="24" w16cid:durableId="1976984656">
-    <w:abstractNumId w:val="17"/>
-  </w:num>
-  <w:num w:numId="25" w16cid:durableId="943225170">
-    <w:abstractNumId w:val="18"/>
-  </w:num>
-  <w:num w:numId="26" w16cid:durableId="1837917902">
-    <w:abstractNumId w:val="19"/>
-  </w:num>
-  <w:num w:numId="27" w16cid:durableId="671033056">
+  <w:num w:numId="28" w16cid:durableId="681276785">
     <w:abstractNumId w:val="0"/>
   </w:num>
 </w:numbering>
@@ -11458,7 +12038,6 @@
   <w:style w:type="character" w:default="1" w:styleId="Fontepargpadro">
     <w:name w:val="Default Paragraph Font"/>
     <w:uiPriority w:val="1"/>
-    <w:semiHidden/>
     <w:unhideWhenUsed/>
   </w:style>
   <w:style w:type="table" w:default="1" w:styleId="Tabelanormal">
@@ -11831,6 +12410,72 @@
       <w:shd w:val="clear" w:color="auto" w:fill="E1DFDD"/>
     </w:rPr>
   </w:style>
+  <w:style w:type="paragraph" w:customStyle="1" w:styleId="Compact">
+    <w:name w:val="Compact"/>
+    <w:basedOn w:val="Corpodetexto"/>
+    <w:qFormat/>
+    <w:rsid w:val="008C0F41"/>
+    <w:pPr>
+      <w:spacing w:before="36" w:after="36" w:line="240" w:lineRule="auto"/>
+    </w:pPr>
+    <w:rPr>
+      <w:sz w:val="24"/>
+      <w:szCs w:val="24"/>
+      <w:lang w:val="en-US"/>
+    </w:rPr>
+  </w:style>
+  <w:style w:type="paragraph" w:styleId="Corpodetexto">
+    <w:name w:val="Body Text"/>
+    <w:basedOn w:val="Normal"/>
+    <w:link w:val="CorpodetextoChar"/>
+    <w:uiPriority w:val="99"/>
+    <w:semiHidden/>
+    <w:unhideWhenUsed/>
+    <w:rsid w:val="008C0F41"/>
+    <w:pPr>
+      <w:spacing w:after="120"/>
+    </w:pPr>
+  </w:style>
+  <w:style w:type="character" w:customStyle="1" w:styleId="CorpodetextoChar">
+    <w:name w:val="Corpo de texto Char"/>
+    <w:basedOn w:val="Fontepargpadro"/>
+    <w:link w:val="Corpodetexto"/>
+    <w:uiPriority w:val="99"/>
+    <w:semiHidden/>
+    <w:rsid w:val="008C0F41"/>
+  </w:style>
+  <w:style w:type="paragraph" w:customStyle="1" w:styleId="FirstParagraph">
+    <w:name w:val="First Paragraph"/>
+    <w:basedOn w:val="Corpodetexto"/>
+    <w:next w:val="Corpodetexto"/>
+    <w:qFormat/>
+    <w:rsid w:val="006A4396"/>
+    <w:pPr>
+      <w:spacing w:before="180" w:after="180" w:line="240" w:lineRule="auto"/>
+    </w:pPr>
+    <w:rPr>
+      <w:sz w:val="24"/>
+      <w:szCs w:val="24"/>
+      <w:lang w:val="en-US"/>
+    </w:rPr>
+  </w:style>
+  <w:style w:type="paragraph" w:styleId="NormalWeb">
+    <w:name w:val="Normal (Web)"/>
+    <w:basedOn w:val="Normal"/>
+    <w:uiPriority w:val="99"/>
+    <w:semiHidden/>
+    <w:unhideWhenUsed/>
+    <w:rsid w:val="00FF61E7"/>
+    <w:pPr>
+      <w:spacing w:before="100" w:beforeAutospacing="1" w:after="100" w:afterAutospacing="1" w:line="240" w:lineRule="auto"/>
+    </w:pPr>
+    <w:rPr>
+      <w:rFonts w:ascii="Times New Roman" w:eastAsia="Times New Roman" w:hAnsi="Times New Roman" w:cs="Times New Roman"/>
+      <w:sz w:val="24"/>
+      <w:szCs w:val="24"/>
+      <w:lang w:eastAsia="pt-BR"/>
+    </w:rPr>
+  </w:style>
 </w:styles>
 </file>
 

</xml_diff>